<commit_message>
Update landing, reviews, tests and mock exams
</commit_message>
<xml_diff>
--- a/ekonomika_variant_1.docx
+++ b/ekonomika_variant_1.docx
@@ -4,1081 +4,1774 @@
   <w:body>
     <w:p>
       <w:pPr>
-        <w:jc w:val="center"/>
+        <w:widowControl/>
+        <w:spacing w:line="240" w:lineRule="auto" w:after="120"/>
+        <w:jc w:val="left"/>
       </w:pPr>
       <w:r>
         <w:rPr>
+          <w:rFonts w:ascii="Times New Roman" w:hAnsi="Times New Roman" w:eastAsia="Times New Roman"/>
           <w:b/>
-          <w:color w:val="2975E5"/>
-          <w:sz w:val="32"/>
+          <w:color w:val="181A1F"/>
+          <w:sz w:val="28"/>
         </w:rPr>
-        <w:t>ЕГЭ ПО ОБЩЕСТВОЗНАНИЮ — 2026</w:t>
+        <w:t>Тематический пробный вариант № 1. Экономика</w:t>
       </w:r>
     </w:p>
     <w:p>
       <w:pPr>
-        <w:jc w:val="center"/>
+        <w:widowControl/>
+        <w:spacing w:line="240" w:lineRule="auto" w:after="140"/>
+        <w:jc w:val="left"/>
       </w:pPr>
       <w:r>
         <w:rPr>
-          <w:b/>
-          <w:sz w:val="30"/>
+          <w:rFonts w:ascii="Times New Roman" w:hAnsi="Times New Roman" w:eastAsia="Times New Roman"/>
+          <w:color w:val="181A1F"/>
+          <w:sz w:val="28"/>
         </w:rPr>
-        <w:t>Тематический пробный вариант № 1</w:t>
-        <w:br/>
-        <w:t>Экономика</w:t>
-      </w:r>
-    </w:p>
-    <w:p>
-      <w:r>
         <w:t>25 заданий • максимальный первичный балл — 58 • рекомендуемое время — 3 часа 30 минут</w:t>
       </w:r>
     </w:p>
     <w:p>
+      <w:pPr>
+        <w:pStyle w:val="Heading1"/>
+        <w:keepNext/>
+        <w:widowControl/>
+        <w:spacing w:line="240" w:lineRule="auto" w:after="60" w:before="160"/>
+      </w:pPr>
       <w:r>
         <w:rPr>
-          <w:i/>
+          <w:rFonts w:ascii="Times New Roman" w:hAnsi="Times New Roman" w:eastAsia="Times New Roman"/>
+          <w:b/>
+          <w:color w:val="181A1F"/>
+          <w:sz w:val="28"/>
         </w:rPr>
-        <w:t>Все задания относятся к указанному разделу; фиксированные тематические номера заменены равноценными по максимальному баллу.</w:t>
-      </w:r>
-    </w:p>
-    <w:p>
-      <w:pPr>
-        <w:pStyle w:val="Heading1"/>
-      </w:pPr>
-      <w:r>
         <w:t>Часть 1</w:t>
       </w:r>
     </w:p>
     <w:p>
+      <w:pPr>
+        <w:widowControl/>
+        <w:spacing w:line="240" w:lineRule="auto" w:after="0"/>
+      </w:pPr>
       <w:r>
+        <w:rPr>
+          <w:rFonts w:ascii="Times New Roman" w:hAnsi="Times New Roman" w:eastAsia="Times New Roman"/>
+          <w:color w:val="181A1F"/>
+          <w:sz w:val="28"/>
+        </w:rPr>
         <w:t>Ответами к заданиям 1–16 являются последовательности цифр. Запишите ответ без пробелов и дополнительных символов.</w:t>
       </w:r>
     </w:p>
     <w:p>
+      <w:pPr>
+        <w:keepNext/>
+        <w:widowControl/>
+        <w:spacing w:line="240" w:lineRule="auto" w:after="0" w:before="120"/>
+      </w:pPr>
       <w:r>
         <w:rPr>
+          <w:rFonts w:ascii="Times New Roman" w:hAnsi="Times New Roman" w:eastAsia="Times New Roman"/>
           <w:b/>
-          <w:sz w:val="24"/>
+          <w:color w:val="181A1F"/>
+          <w:sz w:val="28"/>
         </w:rPr>
         <w:t>1.</w:t>
       </w:r>
     </w:p>
     <w:p>
+      <w:pPr>
+        <w:widowControl/>
+        <w:spacing w:line="240" w:lineRule="auto" w:after="0"/>
+      </w:pPr>
       <w:r>
         <w:rPr>
+          <w:rFonts w:ascii="Times New Roman" w:hAnsi="Times New Roman" w:eastAsia="Times New Roman"/>
           <w:b w:val="0"/>
           <w:i w:val="0"/>
+          <w:color w:val="181A1F"/>
+          <w:sz w:val="28"/>
         </w:rPr>
         <w:t>Ниже приведён перечень налогов и сборов. Все они, за исключением двух, в соответствии с Налоговым кодексом РФ относятся к федеральным налогам и сборам.</w:t>
       </w:r>
     </w:p>
     <w:p>
+      <w:pPr>
+        <w:widowControl/>
+        <w:spacing w:line="240" w:lineRule="auto" w:after="0"/>
+      </w:pPr>
       <w:r>
         <w:rPr>
+          <w:rFonts w:ascii="Times New Roman" w:hAnsi="Times New Roman" w:eastAsia="Times New Roman"/>
           <w:b w:val="0"/>
           <w:i w:val="0"/>
+          <w:color w:val="181A1F"/>
+          <w:sz w:val="28"/>
         </w:rPr>
         <w:t xml:space="preserve">1) налог на добавленную стоимость; </w:t>
       </w:r>
     </w:p>
     <w:p>
+      <w:pPr>
+        <w:widowControl/>
+        <w:spacing w:line="240" w:lineRule="auto" w:after="0"/>
+      </w:pPr>
       <w:r>
         <w:rPr>
+          <w:rFonts w:ascii="Times New Roman" w:hAnsi="Times New Roman" w:eastAsia="Times New Roman"/>
           <w:b w:val="0"/>
           <w:i w:val="0"/>
+          <w:color w:val="181A1F"/>
+          <w:sz w:val="28"/>
         </w:rPr>
         <w:t>2) налог на доходы физических лиц;</w:t>
       </w:r>
     </w:p>
     <w:p>
+      <w:pPr>
+        <w:widowControl/>
+        <w:spacing w:line="240" w:lineRule="auto" w:after="0"/>
+      </w:pPr>
       <w:r>
         <w:rPr>
+          <w:rFonts w:ascii="Times New Roman" w:hAnsi="Times New Roman" w:eastAsia="Times New Roman"/>
           <w:b w:val="0"/>
           <w:i w:val="0"/>
+          <w:color w:val="181A1F"/>
+          <w:sz w:val="28"/>
         </w:rPr>
         <w:t xml:space="preserve">3) торговый сбор; </w:t>
       </w:r>
     </w:p>
     <w:p>
+      <w:pPr>
+        <w:widowControl/>
+        <w:spacing w:line="240" w:lineRule="auto" w:after="0"/>
+      </w:pPr>
       <w:r>
         <w:rPr>
+          <w:rFonts w:ascii="Times New Roman" w:hAnsi="Times New Roman" w:eastAsia="Times New Roman"/>
           <w:b w:val="0"/>
           <w:i w:val="0"/>
+          <w:color w:val="181A1F"/>
+          <w:sz w:val="28"/>
         </w:rPr>
         <w:t xml:space="preserve">4) транспортный налог; </w:t>
       </w:r>
     </w:p>
     <w:p>
+      <w:pPr>
+        <w:widowControl/>
+        <w:spacing w:line="240" w:lineRule="auto" w:after="0"/>
+      </w:pPr>
       <w:r>
         <w:rPr>
+          <w:rFonts w:ascii="Times New Roman" w:hAnsi="Times New Roman" w:eastAsia="Times New Roman"/>
           <w:b w:val="0"/>
           <w:i w:val="0"/>
+          <w:color w:val="181A1F"/>
+          <w:sz w:val="28"/>
         </w:rPr>
         <w:t xml:space="preserve">5) акцизы; </w:t>
       </w:r>
     </w:p>
     <w:p>
+      <w:pPr>
+        <w:widowControl/>
+        <w:spacing w:line="240" w:lineRule="auto" w:after="0"/>
+      </w:pPr>
       <w:r>
         <w:rPr>
+          <w:rFonts w:ascii="Times New Roman" w:hAnsi="Times New Roman" w:eastAsia="Times New Roman"/>
           <w:b w:val="0"/>
           <w:i w:val="0"/>
+          <w:color w:val="181A1F"/>
+          <w:sz w:val="28"/>
         </w:rPr>
         <w:t>6) водный налог.</w:t>
       </w:r>
     </w:p>
     <w:p>
+      <w:pPr>
+        <w:widowControl/>
+        <w:spacing w:line="240" w:lineRule="auto" w:after="0"/>
+      </w:pPr>
       <w:r>
         <w:rPr>
+          <w:rFonts w:ascii="Times New Roman" w:hAnsi="Times New Roman" w:eastAsia="Times New Roman"/>
           <w:b w:val="0"/>
           <w:i w:val="0"/>
+          <w:color w:val="181A1F"/>
+          <w:sz w:val="28"/>
         </w:rPr>
         <w:t>Найдите два налога и сбора, «выпадающих» из общего ряда, и запишите</w:t>
       </w:r>
     </w:p>
     <w:p>
+      <w:pPr>
+        <w:widowControl/>
+        <w:spacing w:line="240" w:lineRule="auto" w:after="0"/>
+      </w:pPr>
       <w:r>
         <w:rPr>
+          <w:rFonts w:ascii="Times New Roman" w:hAnsi="Times New Roman" w:eastAsia="Times New Roman"/>
           <w:b w:val="0"/>
           <w:i w:val="0"/>
+          <w:color w:val="181A1F"/>
+          <w:sz w:val="28"/>
         </w:rPr>
         <w:t>в таблицу цифры, под которыми они указаны.</w:t>
       </w:r>
     </w:p>
     <w:p>
-      <w:r>
-        <w:t>Ответ: ______________________________</w:t>
-      </w:r>
-    </w:p>
-    <w:p>
+      <w:pPr>
+        <w:keepNext/>
+        <w:widowControl/>
+        <w:spacing w:line="240" w:lineRule="auto" w:after="0" w:before="120"/>
+      </w:pPr>
       <w:r>
         <w:rPr>
+          <w:rFonts w:ascii="Times New Roman" w:hAnsi="Times New Roman" w:eastAsia="Times New Roman"/>
           <w:b/>
-          <w:sz w:val="24"/>
+          <w:color w:val="181A1F"/>
+          <w:sz w:val="28"/>
         </w:rPr>
         <w:t>2.</w:t>
       </w:r>
     </w:p>
     <w:p>
+      <w:pPr>
+        <w:widowControl/>
+        <w:spacing w:line="240" w:lineRule="auto" w:after="0"/>
+      </w:pPr>
       <w:r>
         <w:rPr>
+          <w:rFonts w:ascii="Times New Roman" w:hAnsi="Times New Roman" w:eastAsia="Times New Roman"/>
           <w:b w:val="0"/>
           <w:i w:val="0"/>
+          <w:color w:val="181A1F"/>
+          <w:sz w:val="28"/>
         </w:rPr>
         <w:t>Ателье специализируется на пошиве карнавальных костюмов. Найдите в приведённом списке примеры постоянных издержек ателье в краткосрочном периоде и запишите цифры, под которыми они указаны.</w:t>
       </w:r>
     </w:p>
     <w:p>
+      <w:pPr>
+        <w:widowControl/>
+        <w:spacing w:line="240" w:lineRule="auto" w:after="0"/>
+      </w:pPr>
       <w:r>
         <w:rPr>
+          <w:rFonts w:ascii="Times New Roman" w:hAnsi="Times New Roman" w:eastAsia="Times New Roman"/>
           <w:b w:val="0"/>
           <w:i w:val="0"/>
+          <w:color w:val="181A1F"/>
+          <w:sz w:val="28"/>
         </w:rPr>
         <w:t>1) должностной оклад главного бухгалтера</w:t>
       </w:r>
     </w:p>
     <w:p>
+      <w:pPr>
+        <w:widowControl/>
+        <w:spacing w:line="240" w:lineRule="auto" w:after="0"/>
+      </w:pPr>
       <w:r>
         <w:rPr>
+          <w:rFonts w:ascii="Times New Roman" w:hAnsi="Times New Roman" w:eastAsia="Times New Roman"/>
           <w:b w:val="0"/>
           <w:i w:val="0"/>
+          <w:color w:val="181A1F"/>
+          <w:sz w:val="28"/>
         </w:rPr>
         <w:t>2) оплата потреблённой электроэнергии</w:t>
       </w:r>
     </w:p>
     <w:p>
+      <w:pPr>
+        <w:widowControl/>
+        <w:spacing w:line="240" w:lineRule="auto" w:after="0"/>
+      </w:pPr>
       <w:r>
         <w:rPr>
+          <w:rFonts w:ascii="Times New Roman" w:hAnsi="Times New Roman" w:eastAsia="Times New Roman"/>
           <w:b w:val="0"/>
           <w:i w:val="0"/>
+          <w:color w:val="181A1F"/>
+          <w:sz w:val="28"/>
         </w:rPr>
         <w:t>3) сдельная оплата труда мастеров</w:t>
       </w:r>
     </w:p>
     <w:p>
+      <w:pPr>
+        <w:widowControl/>
+        <w:spacing w:line="240" w:lineRule="auto" w:after="0"/>
+      </w:pPr>
       <w:r>
         <w:rPr>
+          <w:rFonts w:ascii="Times New Roman" w:hAnsi="Times New Roman" w:eastAsia="Times New Roman"/>
           <w:b w:val="0"/>
           <w:i w:val="0"/>
+          <w:color w:val="181A1F"/>
+          <w:sz w:val="28"/>
         </w:rPr>
         <w:t>4) арендная плата за помещение</w:t>
       </w:r>
     </w:p>
     <w:p>
+      <w:pPr>
+        <w:widowControl/>
+        <w:spacing w:line="240" w:lineRule="auto" w:after="0"/>
+      </w:pPr>
       <w:r>
         <w:rPr>
+          <w:rFonts w:ascii="Times New Roman" w:hAnsi="Times New Roman" w:eastAsia="Times New Roman"/>
           <w:b w:val="0"/>
           <w:i w:val="0"/>
+          <w:color w:val="181A1F"/>
+          <w:sz w:val="28"/>
         </w:rPr>
         <w:t>5) приобретение тканей, фурнитуры</w:t>
       </w:r>
     </w:p>
     <w:p>
+      <w:pPr>
+        <w:widowControl/>
+        <w:spacing w:line="240" w:lineRule="auto" w:after="0"/>
+      </w:pPr>
       <w:r>
         <w:rPr>
+          <w:rFonts w:ascii="Times New Roman" w:hAnsi="Times New Roman" w:eastAsia="Times New Roman"/>
           <w:b w:val="0"/>
           <w:i w:val="0"/>
+          <w:color w:val="181A1F"/>
+          <w:sz w:val="28"/>
         </w:rPr>
         <w:t>6) выплата процентов по ранее взятому кредиту</w:t>
       </w:r>
     </w:p>
     <w:p>
-      <w:r>
-        <w:t>Ответ: ______________________________</w:t>
-      </w:r>
-    </w:p>
-    <w:p>
+      <w:pPr>
+        <w:keepNext/>
+        <w:widowControl/>
+        <w:spacing w:line="240" w:lineRule="auto" w:after="0" w:before="120"/>
+      </w:pPr>
       <w:r>
         <w:rPr>
+          <w:rFonts w:ascii="Times New Roman" w:hAnsi="Times New Roman" w:eastAsia="Times New Roman"/>
           <w:b/>
-          <w:sz w:val="24"/>
+          <w:color w:val="181A1F"/>
+          <w:sz w:val="28"/>
         </w:rPr>
         <w:t>3.</w:t>
       </w:r>
     </w:p>
     <w:p>
+      <w:pPr>
+        <w:widowControl/>
+        <w:spacing w:line="240" w:lineRule="auto" w:after="0"/>
+      </w:pPr>
       <w:r>
         <w:rPr>
+          <w:rFonts w:ascii="Times New Roman" w:hAnsi="Times New Roman" w:eastAsia="Times New Roman"/>
           <w:b w:val="0"/>
           <w:i w:val="0"/>
+          <w:color w:val="181A1F"/>
+          <w:sz w:val="28"/>
         </w:rPr>
         <w:t>Ниже приведён перечень платежей. Все они, за исключением двух, согласно Налоговому кодексу Российской Федерации, относятся к федеральным налогам и сборам.</w:t>
       </w:r>
     </w:p>
     <w:p>
+      <w:pPr>
+        <w:widowControl/>
+        <w:spacing w:line="240" w:lineRule="auto" w:after="0"/>
+      </w:pPr>
       <w:r>
         <w:rPr>
+          <w:rFonts w:ascii="Times New Roman" w:hAnsi="Times New Roman" w:eastAsia="Times New Roman"/>
           <w:b w:val="0"/>
           <w:i w:val="0"/>
+          <w:color w:val="181A1F"/>
+          <w:sz w:val="28"/>
         </w:rPr>
         <w:t>1) земельный налог;</w:t>
       </w:r>
     </w:p>
     <w:p>
+      <w:pPr>
+        <w:widowControl/>
+        <w:spacing w:line="240" w:lineRule="auto" w:after="0"/>
+      </w:pPr>
       <w:r>
         <w:rPr>
+          <w:rFonts w:ascii="Times New Roman" w:hAnsi="Times New Roman" w:eastAsia="Times New Roman"/>
           <w:b w:val="0"/>
           <w:i w:val="0"/>
+          <w:color w:val="181A1F"/>
+          <w:sz w:val="28"/>
         </w:rPr>
         <w:t>2) водный налог;</w:t>
       </w:r>
     </w:p>
     <w:p>
+      <w:pPr>
+        <w:widowControl/>
+        <w:spacing w:line="240" w:lineRule="auto" w:after="0"/>
+      </w:pPr>
       <w:r>
         <w:rPr>
+          <w:rFonts w:ascii="Times New Roman" w:hAnsi="Times New Roman" w:eastAsia="Times New Roman"/>
           <w:b w:val="0"/>
           <w:i w:val="0"/>
+          <w:color w:val="181A1F"/>
+          <w:sz w:val="28"/>
         </w:rPr>
         <w:t>3) налог на прибыль организаций;</w:t>
       </w:r>
     </w:p>
     <w:p>
+      <w:pPr>
+        <w:widowControl/>
+        <w:spacing w:line="240" w:lineRule="auto" w:after="0"/>
+      </w:pPr>
       <w:r>
         <w:rPr>
+          <w:rFonts w:ascii="Times New Roman" w:hAnsi="Times New Roman" w:eastAsia="Times New Roman"/>
           <w:b w:val="0"/>
           <w:i w:val="0"/>
+          <w:color w:val="181A1F"/>
+          <w:sz w:val="28"/>
         </w:rPr>
         <w:t>4) налог на добычу полезных ископаемых;</w:t>
       </w:r>
     </w:p>
     <w:p>
+      <w:pPr>
+        <w:widowControl/>
+        <w:spacing w:line="240" w:lineRule="auto" w:after="0"/>
+      </w:pPr>
       <w:r>
         <w:rPr>
+          <w:rFonts w:ascii="Times New Roman" w:hAnsi="Times New Roman" w:eastAsia="Times New Roman"/>
           <w:b w:val="0"/>
           <w:i w:val="0"/>
+          <w:color w:val="181A1F"/>
+          <w:sz w:val="28"/>
         </w:rPr>
         <w:t>5) государственная пошлина;</w:t>
       </w:r>
     </w:p>
     <w:p>
+      <w:pPr>
+        <w:widowControl/>
+        <w:spacing w:line="240" w:lineRule="auto" w:after="0"/>
+      </w:pPr>
       <w:r>
         <w:rPr>
+          <w:rFonts w:ascii="Times New Roman" w:hAnsi="Times New Roman" w:eastAsia="Times New Roman"/>
           <w:b w:val="0"/>
           <w:i w:val="0"/>
+          <w:color w:val="181A1F"/>
+          <w:sz w:val="28"/>
         </w:rPr>
         <w:t>6) торговый сбор.</w:t>
       </w:r>
     </w:p>
     <w:p>
+      <w:pPr>
+        <w:widowControl/>
+        <w:spacing w:line="240" w:lineRule="auto" w:after="0"/>
+      </w:pPr>
       <w:r>
         <w:rPr>
+          <w:rFonts w:ascii="Times New Roman" w:hAnsi="Times New Roman" w:eastAsia="Times New Roman"/>
           <w:b w:val="0"/>
           <w:i w:val="0"/>
+          <w:color w:val="181A1F"/>
+          <w:sz w:val="28"/>
         </w:rPr>
         <w:t>Найдите два термина, «выпадающих» из общего ряда, и запишите в таблицу цифры, под которыми они указаны.</w:t>
       </w:r>
     </w:p>
     <w:p>
-      <w:r>
-        <w:t>Ответ: ______________________________</w:t>
-      </w:r>
-    </w:p>
-    <w:p>
+      <w:pPr>
+        <w:keepNext/>
+        <w:widowControl/>
+        <w:spacing w:line="240" w:lineRule="auto" w:after="0" w:before="120"/>
+      </w:pPr>
       <w:r>
         <w:rPr>
+          <w:rFonts w:ascii="Times New Roman" w:hAnsi="Times New Roman" w:eastAsia="Times New Roman"/>
           <w:b/>
-          <w:sz w:val="24"/>
+          <w:color w:val="181A1F"/>
+          <w:sz w:val="28"/>
         </w:rPr>
         <w:t>4.</w:t>
       </w:r>
     </w:p>
     <w:p>
+      <w:pPr>
+        <w:widowControl/>
+        <w:spacing w:line="240" w:lineRule="auto" w:after="0"/>
+      </w:pPr>
       <w:r>
         <w:rPr>
+          <w:rFonts w:ascii="Times New Roman" w:hAnsi="Times New Roman" w:eastAsia="Times New Roman"/>
           <w:b w:val="0"/>
           <w:i w:val="0"/>
+          <w:color w:val="181A1F"/>
+          <w:sz w:val="28"/>
         </w:rPr>
         <w:t>В стране Z сократились потребление и экспорт угля, большинство шахт закрылось, десятки тысяч шахтёров потеряли работу. Выберите из приведённого ниже списка характеристики возникшей безработицы и запишите цифры, под которыми они указаны.</w:t>
       </w:r>
     </w:p>
     <w:p>
+      <w:pPr>
+        <w:widowControl/>
+        <w:spacing w:line="240" w:lineRule="auto" w:after="0"/>
+      </w:pPr>
       <w:r>
         <w:rPr>
+          <w:rFonts w:ascii="Times New Roman" w:hAnsi="Times New Roman" w:eastAsia="Times New Roman"/>
           <w:b w:val="0"/>
           <w:i w:val="0"/>
+          <w:color w:val="181A1F"/>
+          <w:sz w:val="28"/>
         </w:rPr>
         <w:t>1) скрытая безработица</w:t>
       </w:r>
     </w:p>
     <w:p>
+      <w:pPr>
+        <w:widowControl/>
+        <w:spacing w:line="240" w:lineRule="auto" w:after="0"/>
+      </w:pPr>
       <w:r>
         <w:rPr>
+          <w:rFonts w:ascii="Times New Roman" w:hAnsi="Times New Roman" w:eastAsia="Times New Roman"/>
           <w:b w:val="0"/>
           <w:i w:val="0"/>
+          <w:color w:val="181A1F"/>
+          <w:sz w:val="28"/>
         </w:rPr>
         <w:t>2) фрикционная безработица</w:t>
       </w:r>
     </w:p>
     <w:p>
+      <w:pPr>
+        <w:widowControl/>
+        <w:spacing w:line="240" w:lineRule="auto" w:after="0"/>
+      </w:pPr>
       <w:r>
         <w:rPr>
+          <w:rFonts w:ascii="Times New Roman" w:hAnsi="Times New Roman" w:eastAsia="Times New Roman"/>
           <w:b w:val="0"/>
           <w:i w:val="0"/>
+          <w:color w:val="181A1F"/>
+          <w:sz w:val="28"/>
         </w:rPr>
         <w:t>3) сезонная безработица</w:t>
       </w:r>
     </w:p>
     <w:p>
+      <w:pPr>
+        <w:widowControl/>
+        <w:spacing w:line="240" w:lineRule="auto" w:after="0"/>
+      </w:pPr>
       <w:r>
         <w:rPr>
+          <w:rFonts w:ascii="Times New Roman" w:hAnsi="Times New Roman" w:eastAsia="Times New Roman"/>
           <w:b w:val="0"/>
           <w:i w:val="0"/>
+          <w:color w:val="181A1F"/>
+          <w:sz w:val="28"/>
         </w:rPr>
         <w:t>4) добровольная безработица</w:t>
       </w:r>
     </w:p>
     <w:p>
+      <w:pPr>
+        <w:widowControl/>
+        <w:spacing w:line="240" w:lineRule="auto" w:after="0"/>
+      </w:pPr>
       <w:r>
         <w:rPr>
+          <w:rFonts w:ascii="Times New Roman" w:hAnsi="Times New Roman" w:eastAsia="Times New Roman"/>
           <w:b w:val="0"/>
           <w:i w:val="0"/>
+          <w:color w:val="181A1F"/>
+          <w:sz w:val="28"/>
         </w:rPr>
         <w:t>5) структурная безработица</w:t>
       </w:r>
     </w:p>
     <w:p>
+      <w:pPr>
+        <w:widowControl/>
+        <w:spacing w:line="240" w:lineRule="auto" w:after="0"/>
+      </w:pPr>
       <w:r>
         <w:rPr>
+          <w:rFonts w:ascii="Times New Roman" w:hAnsi="Times New Roman" w:eastAsia="Times New Roman"/>
           <w:b w:val="0"/>
           <w:i w:val="0"/>
+          <w:color w:val="181A1F"/>
+          <w:sz w:val="28"/>
         </w:rPr>
         <w:t>6) массовая безработица</w:t>
       </w:r>
     </w:p>
     <w:p>
-      <w:r>
-        <w:t>Ответ: ______________________________</w:t>
-      </w:r>
-    </w:p>
-    <w:p>
+      <w:pPr>
+        <w:keepNext/>
+        <w:widowControl/>
+        <w:spacing w:line="240" w:lineRule="auto" w:after="0" w:before="120"/>
+      </w:pPr>
       <w:r>
         <w:rPr>
+          <w:rFonts w:ascii="Times New Roman" w:hAnsi="Times New Roman" w:eastAsia="Times New Roman"/>
           <w:b/>
-          <w:sz w:val="24"/>
+          <w:color w:val="181A1F"/>
+          <w:sz w:val="28"/>
         </w:rPr>
         <w:t>5.</w:t>
       </w:r>
     </w:p>
     <w:p>
+      <w:pPr>
+        <w:widowControl/>
+        <w:spacing w:line="240" w:lineRule="auto" w:after="0"/>
+      </w:pPr>
       <w:r>
         <w:rPr>
+          <w:rFonts w:ascii="Times New Roman" w:hAnsi="Times New Roman" w:eastAsia="Times New Roman"/>
           <w:b w:val="0"/>
           <w:i w:val="0"/>
+          <w:color w:val="181A1F"/>
+          <w:sz w:val="28"/>
         </w:rPr>
         <w:t>Иоланта работает менеджером среднего звена. Часть своих сбережений она разместила на банковском депозите. Комнату в своей квартире она сдала внаем через агентство недвижимости. Иоланта взяла кредит на покупку автомобиля. Что из перечисленного относится к доходам Иоланты? Запишите цифры, под которыми они указаны.</w:t>
       </w:r>
     </w:p>
     <w:p>
+      <w:pPr>
+        <w:widowControl/>
+        <w:spacing w:line="240" w:lineRule="auto" w:after="0"/>
+      </w:pPr>
       <w:r>
         <w:rPr>
+          <w:rFonts w:ascii="Times New Roman" w:hAnsi="Times New Roman" w:eastAsia="Times New Roman"/>
           <w:b w:val="0"/>
           <w:i w:val="0"/>
+          <w:color w:val="181A1F"/>
+          <w:sz w:val="28"/>
         </w:rPr>
         <w:t>1) коммунальные платежи</w:t>
       </w:r>
     </w:p>
     <w:p>
+      <w:pPr>
+        <w:widowControl/>
+        <w:spacing w:line="240" w:lineRule="auto" w:after="0"/>
+      </w:pPr>
       <w:r>
         <w:rPr>
+          <w:rFonts w:ascii="Times New Roman" w:hAnsi="Times New Roman" w:eastAsia="Times New Roman"/>
           <w:b w:val="0"/>
           <w:i w:val="0"/>
+          <w:color w:val="181A1F"/>
+          <w:sz w:val="28"/>
         </w:rPr>
         <w:t>2) заработная плата</w:t>
       </w:r>
     </w:p>
     <w:p>
+      <w:pPr>
+        <w:widowControl/>
+        <w:spacing w:line="240" w:lineRule="auto" w:after="0"/>
+      </w:pPr>
       <w:r>
         <w:rPr>
+          <w:rFonts w:ascii="Times New Roman" w:hAnsi="Times New Roman" w:eastAsia="Times New Roman"/>
           <w:b w:val="0"/>
           <w:i w:val="0"/>
+          <w:color w:val="181A1F"/>
+          <w:sz w:val="28"/>
         </w:rPr>
         <w:t>3) арендная плата за сдачу внаём комнаты</w:t>
       </w:r>
     </w:p>
     <w:p>
+      <w:pPr>
+        <w:widowControl/>
+        <w:spacing w:line="240" w:lineRule="auto" w:after="0"/>
+      </w:pPr>
       <w:r>
         <w:rPr>
+          <w:rFonts w:ascii="Times New Roman" w:hAnsi="Times New Roman" w:eastAsia="Times New Roman"/>
           <w:b w:val="0"/>
           <w:i w:val="0"/>
+          <w:color w:val="181A1F"/>
+          <w:sz w:val="28"/>
         </w:rPr>
         <w:t>4) транспортный налог</w:t>
       </w:r>
     </w:p>
     <w:p>
+      <w:pPr>
+        <w:widowControl/>
+        <w:spacing w:line="240" w:lineRule="auto" w:after="0"/>
+      </w:pPr>
       <w:r>
         <w:rPr>
+          <w:rFonts w:ascii="Times New Roman" w:hAnsi="Times New Roman" w:eastAsia="Times New Roman"/>
           <w:b w:val="0"/>
           <w:i w:val="0"/>
+          <w:color w:val="181A1F"/>
+          <w:sz w:val="28"/>
         </w:rPr>
         <w:t>5) проценты по кредиту</w:t>
       </w:r>
     </w:p>
     <w:p>
+      <w:pPr>
+        <w:widowControl/>
+        <w:spacing w:line="240" w:lineRule="auto" w:after="0"/>
+      </w:pPr>
       <w:r>
         <w:rPr>
+          <w:rFonts w:ascii="Times New Roman" w:hAnsi="Times New Roman" w:eastAsia="Times New Roman"/>
           <w:b w:val="0"/>
           <w:i w:val="0"/>
+          <w:color w:val="181A1F"/>
+          <w:sz w:val="28"/>
         </w:rPr>
         <w:t>6) проценты по вкладу</w:t>
       </w:r>
     </w:p>
     <w:p>
-      <w:r>
-        <w:t>Ответ: ______________________________</w:t>
-      </w:r>
-    </w:p>
-    <w:p>
+      <w:pPr>
+        <w:keepNext/>
+        <w:widowControl/>
+        <w:spacing w:line="240" w:lineRule="auto" w:after="0" w:before="120"/>
+      </w:pPr>
       <w:r>
         <w:rPr>
+          <w:rFonts w:ascii="Times New Roman" w:hAnsi="Times New Roman" w:eastAsia="Times New Roman"/>
           <w:b/>
-          <w:sz w:val="24"/>
+          <w:color w:val="181A1F"/>
+          <w:sz w:val="28"/>
         </w:rPr>
         <w:t>6.</w:t>
       </w:r>
     </w:p>
     <w:p>
+      <w:pPr>
+        <w:widowControl/>
+        <w:spacing w:line="240" w:lineRule="auto" w:after="0"/>
+      </w:pPr>
       <w:r>
         <w:rPr>
+          <w:rFonts w:ascii="Times New Roman" w:hAnsi="Times New Roman" w:eastAsia="Times New Roman"/>
           <w:b w:val="0"/>
           <w:i w:val="0"/>
+          <w:color w:val="181A1F"/>
+          <w:sz w:val="28"/>
         </w:rPr>
         <w:t>Выберите верные суждения о государственной поддержке социально незащищённых слоёв российского общества и запишите цифры, под которыми они указаны.</w:t>
       </w:r>
     </w:p>
     <w:p>
+      <w:pPr>
+        <w:widowControl/>
+        <w:spacing w:line="240" w:lineRule="auto" w:after="0"/>
+      </w:pPr>
       <w:r>
         <w:rPr>
+          <w:rFonts w:ascii="Times New Roman" w:hAnsi="Times New Roman" w:eastAsia="Times New Roman"/>
           <w:b w:val="0"/>
           <w:i w:val="0"/>
+          <w:color w:val="181A1F"/>
+          <w:sz w:val="28"/>
         </w:rPr>
         <w:t>1) Пенсия — это ежемесячная денежная выплата, компенсирующая заработную плату наёмного работника, которую он получал в период трудовой деятельности.</w:t>
       </w:r>
     </w:p>
     <w:p>
+      <w:pPr>
+        <w:widowControl/>
+        <w:spacing w:line="240" w:lineRule="auto" w:after="0"/>
+      </w:pPr>
       <w:r>
         <w:rPr>
+          <w:rFonts w:ascii="Times New Roman" w:hAnsi="Times New Roman" w:eastAsia="Times New Roman"/>
           <w:b w:val="0"/>
           <w:i w:val="0"/>
+          <w:color w:val="181A1F"/>
+          <w:sz w:val="28"/>
         </w:rPr>
         <w:t>2) Правом на получение пенсии в настоящее время обладает любой гражданин по достижении 50 лет.</w:t>
       </w:r>
     </w:p>
     <w:p>
+      <w:pPr>
+        <w:widowControl/>
+        <w:spacing w:line="240" w:lineRule="auto" w:after="0"/>
+      </w:pPr>
       <w:r>
         <w:rPr>
+          <w:rFonts w:ascii="Times New Roman" w:hAnsi="Times New Roman" w:eastAsia="Times New Roman"/>
           <w:b w:val="0"/>
           <w:i w:val="0"/>
+          <w:color w:val="181A1F"/>
+          <w:sz w:val="28"/>
         </w:rPr>
         <w:t>3) Предоставление жилья за счёт государственного жилого фонда относят к трудовым пособиям.</w:t>
       </w:r>
     </w:p>
     <w:p>
+      <w:pPr>
+        <w:widowControl/>
+        <w:spacing w:line="240" w:lineRule="auto" w:after="0"/>
+      </w:pPr>
       <w:r>
         <w:rPr>
+          <w:rFonts w:ascii="Times New Roman" w:hAnsi="Times New Roman" w:eastAsia="Times New Roman"/>
           <w:b w:val="0"/>
           <w:i w:val="0"/>
+          <w:color w:val="181A1F"/>
+          <w:sz w:val="28"/>
         </w:rPr>
         <w:t>4) Предоставление социальных льгот позволяет обеспечить материальное положение некоторых категорий малоимущих граждан, поскольку часть обязательных расходов государство берёт на себя.</w:t>
       </w:r>
     </w:p>
     <w:p>
+      <w:pPr>
+        <w:widowControl/>
+        <w:spacing w:line="240" w:lineRule="auto" w:after="0"/>
+      </w:pPr>
       <w:r>
         <w:rPr>
+          <w:rFonts w:ascii="Times New Roman" w:hAnsi="Times New Roman" w:eastAsia="Times New Roman"/>
           <w:b w:val="0"/>
           <w:i w:val="0"/>
+          <w:color w:val="181A1F"/>
+          <w:sz w:val="28"/>
         </w:rPr>
         <w:t>5) Натуральное обеспечение предполагает передачу материальных ценностей некоторым категориям граждан в собственность или в пользование.</w:t>
       </w:r>
     </w:p>
     <w:p>
-      <w:r>
-        <w:t>Ответ: ______________________________</w:t>
-      </w:r>
-    </w:p>
-    <w:p>
+      <w:pPr>
+        <w:keepNext/>
+        <w:widowControl/>
+        <w:spacing w:line="240" w:lineRule="auto" w:after="0" w:before="120"/>
+      </w:pPr>
       <w:r>
         <w:rPr>
+          <w:rFonts w:ascii="Times New Roman" w:hAnsi="Times New Roman" w:eastAsia="Times New Roman"/>
           <w:b/>
-          <w:sz w:val="24"/>
+          <w:color w:val="181A1F"/>
+          <w:sz w:val="28"/>
         </w:rPr>
         <w:t>7.</w:t>
       </w:r>
     </w:p>
     <w:p>
+      <w:pPr>
+        <w:widowControl/>
+        <w:spacing w:line="240" w:lineRule="auto" w:after="0"/>
+      </w:pPr>
       <w:r>
         <w:rPr>
+          <w:rFonts w:ascii="Times New Roman" w:hAnsi="Times New Roman" w:eastAsia="Times New Roman"/>
           <w:b w:val="0"/>
           <w:i w:val="0"/>
+          <w:color w:val="181A1F"/>
+          <w:sz w:val="28"/>
         </w:rPr>
         <w:t>Экономика страны Z основана на крупном машинном производстве; в ней доминирует тяжёлая промышленность. Какие признаки позволяют сделать вывод о том, что в стране Z командная (плановая) экономика? Запишите цифры, под которыми они указаны.</w:t>
       </w:r>
     </w:p>
     <w:p>
+      <w:pPr>
+        <w:widowControl/>
+        <w:spacing w:line="240" w:lineRule="auto" w:after="0"/>
+      </w:pPr>
       <w:r>
         <w:rPr>
+          <w:rFonts w:ascii="Times New Roman" w:hAnsi="Times New Roman" w:eastAsia="Times New Roman"/>
           <w:b w:val="0"/>
           <w:i w:val="0"/>
+          <w:color w:val="181A1F"/>
+          <w:sz w:val="28"/>
         </w:rPr>
         <w:t>1) господство государственной собственности на средства производства</w:t>
       </w:r>
     </w:p>
     <w:p>
+      <w:pPr>
+        <w:widowControl/>
+        <w:spacing w:line="240" w:lineRule="auto" w:after="0"/>
+      </w:pPr>
       <w:r>
         <w:rPr>
+          <w:rFonts w:ascii="Times New Roman" w:hAnsi="Times New Roman" w:eastAsia="Times New Roman"/>
           <w:b w:val="0"/>
           <w:i w:val="0"/>
+          <w:color w:val="181A1F"/>
+          <w:sz w:val="28"/>
         </w:rPr>
         <w:t>2) зависимость продовольственного рынка от импортных товаров</w:t>
       </w:r>
     </w:p>
     <w:p>
+      <w:pPr>
+        <w:widowControl/>
+        <w:spacing w:line="240" w:lineRule="auto" w:after="0"/>
+      </w:pPr>
       <w:r>
         <w:rPr>
+          <w:rFonts w:ascii="Times New Roman" w:hAnsi="Times New Roman" w:eastAsia="Times New Roman"/>
           <w:b w:val="0"/>
           <w:i w:val="0"/>
+          <w:color w:val="181A1F"/>
+          <w:sz w:val="28"/>
         </w:rPr>
         <w:t>3) необходимость решения проблемы ограниченности ресурсов</w:t>
       </w:r>
     </w:p>
     <w:p>
+      <w:pPr>
+        <w:widowControl/>
+        <w:spacing w:line="240" w:lineRule="auto" w:after="0"/>
+      </w:pPr>
       <w:r>
         <w:rPr>
+          <w:rFonts w:ascii="Times New Roman" w:hAnsi="Times New Roman" w:eastAsia="Times New Roman"/>
           <w:b w:val="0"/>
           <w:i w:val="0"/>
+          <w:color w:val="181A1F"/>
+          <w:sz w:val="28"/>
         </w:rPr>
         <w:t>4) отсутствие конкуренции производителей</w:t>
       </w:r>
     </w:p>
     <w:p>
+      <w:pPr>
+        <w:widowControl/>
+        <w:spacing w:line="240" w:lineRule="auto" w:after="0"/>
+      </w:pPr>
       <w:r>
         <w:rPr>
+          <w:rFonts w:ascii="Times New Roman" w:hAnsi="Times New Roman" w:eastAsia="Times New Roman"/>
           <w:b w:val="0"/>
           <w:i w:val="0"/>
+          <w:color w:val="181A1F"/>
+          <w:sz w:val="28"/>
         </w:rPr>
         <w:t>5) директивное ценообразование</w:t>
       </w:r>
     </w:p>
     <w:p>
+      <w:pPr>
+        <w:widowControl/>
+        <w:spacing w:line="240" w:lineRule="auto" w:after="0"/>
+      </w:pPr>
       <w:r>
         <w:rPr>
+          <w:rFonts w:ascii="Times New Roman" w:hAnsi="Times New Roman" w:eastAsia="Times New Roman"/>
           <w:b w:val="0"/>
           <w:i w:val="0"/>
+          <w:color w:val="181A1F"/>
+          <w:sz w:val="28"/>
         </w:rPr>
         <w:t>6) наличие трудового законодательства</w:t>
       </w:r>
     </w:p>
     <w:p>
-      <w:r>
-        <w:t>Ответ: ______________________________</w:t>
-      </w:r>
-    </w:p>
-    <w:p>
+      <w:pPr>
+        <w:keepNext/>
+        <w:widowControl/>
+        <w:spacing w:line="240" w:lineRule="auto" w:after="0" w:before="120"/>
+      </w:pPr>
       <w:r>
         <w:rPr>
+          <w:rFonts w:ascii="Times New Roman" w:hAnsi="Times New Roman" w:eastAsia="Times New Roman"/>
           <w:b/>
-          <w:sz w:val="24"/>
+          <w:color w:val="181A1F"/>
+          <w:sz w:val="28"/>
         </w:rPr>
         <w:t>8.</w:t>
       </w:r>
     </w:p>
     <w:p>
+      <w:pPr>
+        <w:widowControl/>
+        <w:spacing w:line="240" w:lineRule="auto" w:after="0"/>
+      </w:pPr>
       <w:r>
         <w:rPr>
+          <w:rFonts w:ascii="Times New Roman" w:hAnsi="Times New Roman" w:eastAsia="Times New Roman"/>
           <w:b w:val="0"/>
           <w:i w:val="0"/>
+          <w:color w:val="181A1F"/>
+          <w:sz w:val="28"/>
         </w:rPr>
         <w:t xml:space="preserve">Выберите верные суждения о факторах производства и запишите цифры, под которыми они указаны. </w:t>
       </w:r>
     </w:p>
     <w:p>
+      <w:pPr>
+        <w:widowControl/>
+        <w:spacing w:line="240" w:lineRule="auto" w:after="0"/>
+      </w:pPr>
       <w:r>
         <w:rPr>
+          <w:rFonts w:ascii="Times New Roman" w:hAnsi="Times New Roman" w:eastAsia="Times New Roman"/>
           <w:b w:val="0"/>
           <w:i w:val="0"/>
+          <w:color w:val="181A1F"/>
+          <w:sz w:val="28"/>
         </w:rPr>
         <w:t xml:space="preserve">1) Собственник земельных ресурсов получает доход, который называется заработной платой. </w:t>
       </w:r>
     </w:p>
     <w:p>
+      <w:pPr>
+        <w:widowControl/>
+        <w:spacing w:line="240" w:lineRule="auto" w:after="0"/>
+      </w:pPr>
       <w:r>
         <w:rPr>
+          <w:rFonts w:ascii="Times New Roman" w:hAnsi="Times New Roman" w:eastAsia="Times New Roman"/>
           <w:b w:val="0"/>
           <w:i w:val="0"/>
+          <w:color w:val="181A1F"/>
+          <w:sz w:val="28"/>
         </w:rPr>
         <w:t xml:space="preserve">2) Факторы производства — это ресурсы, вовлечённые в конкретный производственный процесс создания общественных и частных благ. </w:t>
       </w:r>
     </w:p>
     <w:p>
+      <w:pPr>
+        <w:widowControl/>
+        <w:spacing w:line="240" w:lineRule="auto" w:after="0"/>
+      </w:pPr>
       <w:r>
         <w:rPr>
+          <w:rFonts w:ascii="Times New Roman" w:hAnsi="Times New Roman" w:eastAsia="Times New Roman"/>
           <w:b w:val="0"/>
           <w:i w:val="0"/>
+          <w:color w:val="181A1F"/>
+          <w:sz w:val="28"/>
         </w:rPr>
         <w:t xml:space="preserve">3) К трудовым ресурсам относят всё население страны. </w:t>
       </w:r>
     </w:p>
     <w:p>
+      <w:pPr>
+        <w:widowControl/>
+        <w:spacing w:line="240" w:lineRule="auto" w:after="0"/>
+      </w:pPr>
       <w:r>
         <w:rPr>
+          <w:rFonts w:ascii="Times New Roman" w:hAnsi="Times New Roman" w:eastAsia="Times New Roman"/>
           <w:b w:val="0"/>
           <w:i w:val="0"/>
+          <w:color w:val="181A1F"/>
+          <w:sz w:val="28"/>
         </w:rPr>
         <w:t xml:space="preserve">4) Доход собственника капитала — процент. </w:t>
       </w:r>
     </w:p>
     <w:p>
+      <w:pPr>
+        <w:widowControl/>
+        <w:spacing w:line="240" w:lineRule="auto" w:after="0"/>
+      </w:pPr>
       <w:r>
         <w:rPr>
+          <w:rFonts w:ascii="Times New Roman" w:hAnsi="Times New Roman" w:eastAsia="Times New Roman"/>
           <w:b w:val="0"/>
           <w:i w:val="0"/>
+          <w:color w:val="181A1F"/>
+          <w:sz w:val="28"/>
         </w:rPr>
         <w:t xml:space="preserve">5) Предпринимательские способности приводят в действие другие факторы производства в целях получения прибыли. </w:t>
       </w:r>
     </w:p>
     <w:p>
-      <w:r>
-        <w:t>Ответ: ______________________________</w:t>
-      </w:r>
-    </w:p>
-    <w:p>
+      <w:pPr>
+        <w:keepNext/>
+        <w:widowControl/>
+        <w:spacing w:line="240" w:lineRule="auto" w:after="0" w:before="120"/>
+      </w:pPr>
       <w:r>
         <w:rPr>
+          <w:rFonts w:ascii="Times New Roman" w:hAnsi="Times New Roman" w:eastAsia="Times New Roman"/>
           <w:b/>
-          <w:sz w:val="24"/>
+          <w:color w:val="181A1F"/>
+          <w:sz w:val="28"/>
         </w:rPr>
         <w:t>9.</w:t>
       </w:r>
     </w:p>
     <w:p>
+      <w:pPr>
+        <w:widowControl/>
+        <w:spacing w:line="240" w:lineRule="auto" w:after="0"/>
+      </w:pPr>
       <w:r>
         <w:rPr>
+          <w:rFonts w:ascii="Times New Roman" w:hAnsi="Times New Roman" w:eastAsia="Times New Roman"/>
           <w:b w:val="0"/>
           <w:i w:val="0"/>
+          <w:color w:val="181A1F"/>
+          <w:sz w:val="28"/>
         </w:rPr>
         <w:t>Ниже приведён перечень примеров издержек фирмы в краткосрочном периоде. Все они, за исключением двух, являются постоянными издержками.</w:t>
       </w:r>
     </w:p>
     <w:p>
+      <w:pPr>
+        <w:widowControl/>
+        <w:spacing w:line="240" w:lineRule="auto" w:after="0"/>
+      </w:pPr>
       <w:r>
         <w:rPr>
+          <w:rFonts w:ascii="Times New Roman" w:hAnsi="Times New Roman" w:eastAsia="Times New Roman"/>
           <w:b w:val="0"/>
           <w:i w:val="0"/>
+          <w:color w:val="181A1F"/>
+          <w:sz w:val="28"/>
         </w:rPr>
         <w:t>1) выплата процентов по ранее взятым кредитам;</w:t>
       </w:r>
     </w:p>
     <w:p>
+      <w:pPr>
+        <w:widowControl/>
+        <w:spacing w:line="240" w:lineRule="auto" w:after="0"/>
+      </w:pPr>
       <w:r>
         <w:rPr>
+          <w:rFonts w:ascii="Times New Roman" w:hAnsi="Times New Roman" w:eastAsia="Times New Roman"/>
           <w:b w:val="0"/>
           <w:i w:val="0"/>
+          <w:color w:val="181A1F"/>
+          <w:sz w:val="28"/>
         </w:rPr>
         <w:t>2) оплата охраны офиса;</w:t>
       </w:r>
     </w:p>
     <w:p>
+      <w:pPr>
+        <w:widowControl/>
+        <w:spacing w:line="240" w:lineRule="auto" w:after="0"/>
+      </w:pPr>
       <w:r>
         <w:rPr>
+          <w:rFonts w:ascii="Times New Roman" w:hAnsi="Times New Roman" w:eastAsia="Times New Roman"/>
           <w:b w:val="0"/>
           <w:i w:val="0"/>
+          <w:color w:val="181A1F"/>
+          <w:sz w:val="28"/>
         </w:rPr>
         <w:t>3) плата за аренду помещения;</w:t>
       </w:r>
     </w:p>
     <w:p>
+      <w:pPr>
+        <w:widowControl/>
+        <w:spacing w:line="240" w:lineRule="auto" w:after="0"/>
+      </w:pPr>
       <w:r>
         <w:rPr>
+          <w:rFonts w:ascii="Times New Roman" w:hAnsi="Times New Roman" w:eastAsia="Times New Roman"/>
           <w:b w:val="0"/>
           <w:i w:val="0"/>
+          <w:color w:val="181A1F"/>
+          <w:sz w:val="28"/>
         </w:rPr>
         <w:t>4) оклад аппарата управления;</w:t>
       </w:r>
     </w:p>
     <w:p>
+      <w:pPr>
+        <w:widowControl/>
+        <w:spacing w:line="240" w:lineRule="auto" w:after="0"/>
+      </w:pPr>
       <w:r>
         <w:rPr>
+          <w:rFonts w:ascii="Times New Roman" w:hAnsi="Times New Roman" w:eastAsia="Times New Roman"/>
           <w:b w:val="0"/>
           <w:i w:val="0"/>
+          <w:color w:val="181A1F"/>
+          <w:sz w:val="28"/>
         </w:rPr>
         <w:t>5) сдельная заработная плата рабочих;</w:t>
       </w:r>
     </w:p>
     <w:p>
+      <w:pPr>
+        <w:widowControl/>
+        <w:spacing w:line="240" w:lineRule="auto" w:after="0"/>
+      </w:pPr>
       <w:r>
         <w:rPr>
+          <w:rFonts w:ascii="Times New Roman" w:hAnsi="Times New Roman" w:eastAsia="Times New Roman"/>
           <w:b w:val="0"/>
           <w:i w:val="0"/>
+          <w:color w:val="181A1F"/>
+          <w:sz w:val="28"/>
         </w:rPr>
         <w:t>6) плата за потреблённую электроэнергию.</w:t>
       </w:r>
     </w:p>
     <w:p>
+      <w:pPr>
+        <w:widowControl/>
+        <w:spacing w:line="240" w:lineRule="auto" w:after="0"/>
+      </w:pPr>
       <w:r>
         <w:rPr>
+          <w:rFonts w:ascii="Times New Roman" w:hAnsi="Times New Roman" w:eastAsia="Times New Roman"/>
           <w:b w:val="0"/>
           <w:i w:val="0"/>
+          <w:color w:val="181A1F"/>
+          <w:sz w:val="28"/>
         </w:rPr>
         <w:t>Найдите два примера, «выпадающих» из общего ряда, и запишите в таблицу цифры, под которыми они указаны.</w:t>
       </w:r>
     </w:p>
     <w:p>
-      <w:r>
-        <w:t>Ответ: ______________________________</w:t>
-      </w:r>
-    </w:p>
-    <w:p>
+      <w:pPr>
+        <w:keepNext/>
+        <w:widowControl/>
+        <w:spacing w:line="240" w:lineRule="auto" w:after="0" w:before="120"/>
+      </w:pPr>
       <w:r>
         <w:rPr>
+          <w:rFonts w:ascii="Times New Roman" w:hAnsi="Times New Roman" w:eastAsia="Times New Roman"/>
           <w:b/>
-          <w:sz w:val="24"/>
+          <w:color w:val="181A1F"/>
+          <w:sz w:val="28"/>
         </w:rPr>
         <w:t>10.</w:t>
       </w:r>
     </w:p>
     <w:p>
+      <w:pPr>
+        <w:widowControl/>
+        <w:spacing w:line="240" w:lineRule="auto" w:after="0"/>
+      </w:pPr>
       <w:r>
         <w:rPr>
+          <w:rFonts w:ascii="Times New Roman" w:hAnsi="Times New Roman" w:eastAsia="Times New Roman"/>
           <w:b w:val="0"/>
           <w:i w:val="0"/>
+          <w:color w:val="181A1F"/>
+          <w:sz w:val="28"/>
         </w:rPr>
         <w:t>Выберите верные суждения о мировой экономике и международных экономических отношениях. Запишите цифры, под которыми они указаны.</w:t>
       </w:r>
     </w:p>
     <w:p>
+      <w:pPr>
+        <w:widowControl/>
+        <w:spacing w:line="240" w:lineRule="auto" w:after="0"/>
+      </w:pPr>
       <w:r>
         <w:rPr>
+          <w:rFonts w:ascii="Times New Roman" w:hAnsi="Times New Roman" w:eastAsia="Times New Roman"/>
           <w:b w:val="0"/>
           <w:i w:val="0"/>
+          <w:color w:val="181A1F"/>
+          <w:sz w:val="28"/>
         </w:rPr>
         <w:t>1) Мировой экономикой называют совокупность всех национальных экономик мира.</w:t>
       </w:r>
     </w:p>
     <w:p>
+      <w:pPr>
+        <w:widowControl/>
+        <w:spacing w:line="240" w:lineRule="auto" w:after="0"/>
+      </w:pPr>
       <w:r>
         <w:rPr>
+          <w:rFonts w:ascii="Times New Roman" w:hAnsi="Times New Roman" w:eastAsia="Times New Roman"/>
           <w:b w:val="0"/>
           <w:i w:val="0"/>
+          <w:color w:val="181A1F"/>
+          <w:sz w:val="28"/>
         </w:rPr>
         <w:t>2) Современный мир состоит из полностью открытых экономик, в которых иностранным фирмам открыт доступ на все внутренние рынки.</w:t>
       </w:r>
     </w:p>
     <w:p>
+      <w:pPr>
+        <w:widowControl/>
+        <w:spacing w:line="240" w:lineRule="auto" w:after="0"/>
+      </w:pPr>
       <w:r>
         <w:rPr>
+          <w:rFonts w:ascii="Times New Roman" w:hAnsi="Times New Roman" w:eastAsia="Times New Roman"/>
           <w:b w:val="0"/>
           <w:i w:val="0"/>
+          <w:color w:val="181A1F"/>
+          <w:sz w:val="28"/>
         </w:rPr>
         <w:t>3) В основе развития мировой экономики лежат объективные закономерности интернационализации рыночного хозяйства, выходящего за национальные рамки.</w:t>
       </w:r>
     </w:p>
     <w:p>
+      <w:pPr>
+        <w:widowControl/>
+        <w:spacing w:line="240" w:lineRule="auto" w:after="0"/>
+      </w:pPr>
       <w:r>
         <w:rPr>
+          <w:rFonts w:ascii="Times New Roman" w:hAnsi="Times New Roman" w:eastAsia="Times New Roman"/>
           <w:b w:val="0"/>
           <w:i w:val="0"/>
+          <w:color w:val="181A1F"/>
+          <w:sz w:val="28"/>
         </w:rPr>
         <w:t>4) К тарифным методам регулирования международной торговли относят установление квот, экспортные кредиты и т. п.</w:t>
       </w:r>
     </w:p>
     <w:p>
+      <w:pPr>
+        <w:widowControl/>
+        <w:spacing w:line="240" w:lineRule="auto" w:after="0"/>
+      </w:pPr>
       <w:r>
         <w:rPr>
+          <w:rFonts w:ascii="Times New Roman" w:hAnsi="Times New Roman" w:eastAsia="Times New Roman"/>
           <w:b w:val="0"/>
           <w:i w:val="0"/>
+          <w:color w:val="181A1F"/>
+          <w:sz w:val="28"/>
         </w:rPr>
         <w:t>5) Субъектами мировой экономики являются национальные хозяйства, транснациональные корпорации, международные интеграционные объединения.</w:t>
       </w:r>
     </w:p>
     <w:p>
-      <w:r>
-        <w:t>Ответ: ______________________________</w:t>
-      </w:r>
-    </w:p>
-    <w:p>
+      <w:pPr>
+        <w:keepNext/>
+        <w:widowControl/>
+        <w:spacing w:line="240" w:lineRule="auto" w:after="0" w:before="120"/>
+      </w:pPr>
       <w:r>
         <w:rPr>
+          <w:rFonts w:ascii="Times New Roman" w:hAnsi="Times New Roman" w:eastAsia="Times New Roman"/>
           <w:b/>
-          <w:sz w:val="24"/>
+          <w:color w:val="181A1F"/>
+          <w:sz w:val="28"/>
         </w:rPr>
         <w:t>11.</w:t>
       </w:r>
     </w:p>
     <w:p>
+      <w:pPr>
+        <w:widowControl/>
+        <w:spacing w:line="240" w:lineRule="auto" w:after="0"/>
+      </w:pPr>
       <w:r>
         <w:rPr>
+          <w:rFonts w:ascii="Times New Roman" w:hAnsi="Times New Roman" w:eastAsia="Times New Roman"/>
           <w:b w:val="0"/>
           <w:i w:val="0"/>
+          <w:color w:val="181A1F"/>
+          <w:sz w:val="28"/>
         </w:rPr>
         <w:t>В стране Z развит аграрный сектор экономики, на рынке сельскохозяйственной продукции представлено много производителей. Какие из перечисленных признаков позволяют сделать вывод о том, что в стране Z рыночная экономика? Запишите цифры, под которыми они указаны.</w:t>
       </w:r>
     </w:p>
     <w:p>
+      <w:pPr>
+        <w:widowControl/>
+        <w:spacing w:line="240" w:lineRule="auto" w:after="0"/>
+      </w:pPr>
       <w:r>
         <w:rPr>
+          <w:rFonts w:ascii="Times New Roman" w:hAnsi="Times New Roman" w:eastAsia="Times New Roman"/>
           <w:b w:val="0"/>
           <w:i w:val="0"/>
+          <w:color w:val="181A1F"/>
+          <w:sz w:val="28"/>
         </w:rPr>
         <w:t>1) доминирование интересов и прав потребителя в обеспечении качества и ассортимента товаров и услуг</w:t>
       </w:r>
     </w:p>
     <w:p>
+      <w:pPr>
+        <w:widowControl/>
+        <w:spacing w:line="240" w:lineRule="auto" w:after="0"/>
+      </w:pPr>
       <w:r>
         <w:rPr>
+          <w:rFonts w:ascii="Times New Roman" w:hAnsi="Times New Roman" w:eastAsia="Times New Roman"/>
           <w:b w:val="0"/>
           <w:i w:val="0"/>
+          <w:color w:val="181A1F"/>
+          <w:sz w:val="28"/>
         </w:rPr>
         <w:t>2) формирование равновесной цены на товары и услуги в зависимости от спроса и предложения</w:t>
       </w:r>
     </w:p>
     <w:p>
+      <w:pPr>
+        <w:widowControl/>
+        <w:spacing w:line="240" w:lineRule="auto" w:after="0"/>
+      </w:pPr>
       <w:r>
         <w:rPr>
+          <w:rFonts w:ascii="Times New Roman" w:hAnsi="Times New Roman" w:eastAsia="Times New Roman"/>
           <w:b w:val="0"/>
           <w:i w:val="0"/>
+          <w:color w:val="181A1F"/>
+          <w:sz w:val="28"/>
         </w:rPr>
         <w:t>3) разработка государством директивных планов производства товаров и услуг</w:t>
       </w:r>
     </w:p>
     <w:p>
+      <w:pPr>
+        <w:widowControl/>
+        <w:spacing w:line="240" w:lineRule="auto" w:after="0"/>
+      </w:pPr>
       <w:r>
         <w:rPr>
+          <w:rFonts w:ascii="Times New Roman" w:hAnsi="Times New Roman" w:eastAsia="Times New Roman"/>
           <w:b w:val="0"/>
           <w:i w:val="0"/>
+          <w:color w:val="181A1F"/>
+          <w:sz w:val="28"/>
         </w:rPr>
         <w:t>4) многообразие форм собственности на средства производства</w:t>
       </w:r>
     </w:p>
     <w:p>
+      <w:pPr>
+        <w:widowControl/>
+        <w:spacing w:line="240" w:lineRule="auto" w:after="0"/>
+      </w:pPr>
       <w:r>
         <w:rPr>
+          <w:rFonts w:ascii="Times New Roman" w:hAnsi="Times New Roman" w:eastAsia="Times New Roman"/>
           <w:b w:val="0"/>
           <w:i w:val="0"/>
+          <w:color w:val="181A1F"/>
+          <w:sz w:val="28"/>
         </w:rPr>
         <w:t>5) натуральный характер хозяйства</w:t>
       </w:r>
     </w:p>
     <w:p>
+      <w:pPr>
+        <w:widowControl/>
+        <w:spacing w:line="240" w:lineRule="auto" w:after="0"/>
+      </w:pPr>
       <w:r>
         <w:rPr>
+          <w:rFonts w:ascii="Times New Roman" w:hAnsi="Times New Roman" w:eastAsia="Times New Roman"/>
           <w:b w:val="0"/>
           <w:i w:val="0"/>
+          <w:color w:val="181A1F"/>
+          <w:sz w:val="28"/>
         </w:rPr>
         <w:t>6) опора на традиции ведения хозяйства</w:t>
       </w:r>
     </w:p>
     <w:p>
-      <w:r>
-        <w:t>Ответ: ______________________________</w:t>
-      </w:r>
-    </w:p>
-    <w:p>
+      <w:pPr>
+        <w:keepNext/>
+        <w:widowControl/>
+        <w:spacing w:line="240" w:lineRule="auto" w:after="0" w:before="120"/>
+      </w:pPr>
       <w:r>
         <w:rPr>
+          <w:rFonts w:ascii="Times New Roman" w:hAnsi="Times New Roman" w:eastAsia="Times New Roman"/>
           <w:b/>
-          <w:sz w:val="24"/>
+          <w:color w:val="181A1F"/>
+          <w:sz w:val="28"/>
         </w:rPr>
         <w:t>12.</w:t>
       </w:r>
     </w:p>
     <w:p>
+      <w:pPr>
+        <w:widowControl/>
+        <w:spacing w:line="240" w:lineRule="auto" w:after="0"/>
+      </w:pPr>
       <w:r>
         <w:rPr>
+          <w:rFonts w:ascii="Times New Roman" w:hAnsi="Times New Roman" w:eastAsia="Times New Roman"/>
           <w:b w:val="0"/>
           <w:i w:val="0"/>
+          <w:color w:val="181A1F"/>
+          <w:sz w:val="28"/>
         </w:rPr>
         <w:t>Ниже приведён перечень примеров издержек фирмы в краткосрочном периоде. Все они, за исключением двух, являются постоянными издержками.</w:t>
       </w:r>
     </w:p>
     <w:p>
+      <w:pPr>
+        <w:widowControl/>
+        <w:spacing w:line="240" w:lineRule="auto" w:after="0"/>
+      </w:pPr>
       <w:r>
         <w:rPr>
+          <w:rFonts w:ascii="Times New Roman" w:hAnsi="Times New Roman" w:eastAsia="Times New Roman"/>
           <w:b w:val="0"/>
           <w:i w:val="0"/>
+          <w:color w:val="181A1F"/>
+          <w:sz w:val="28"/>
         </w:rPr>
         <w:t xml:space="preserve">1) плата за охрану помещения; </w:t>
       </w:r>
     </w:p>
     <w:p>
+      <w:pPr>
+        <w:widowControl/>
+        <w:spacing w:line="240" w:lineRule="auto" w:after="0"/>
+      </w:pPr>
       <w:r>
         <w:rPr>
+          <w:rFonts w:ascii="Times New Roman" w:hAnsi="Times New Roman" w:eastAsia="Times New Roman"/>
           <w:b w:val="0"/>
           <w:i w:val="0"/>
+          <w:color w:val="181A1F"/>
+          <w:sz w:val="28"/>
         </w:rPr>
         <w:t xml:space="preserve">2) страховые взносы; </w:t>
       </w:r>
     </w:p>
     <w:p>
+      <w:pPr>
+        <w:widowControl/>
+        <w:spacing w:line="240" w:lineRule="auto" w:after="0"/>
+      </w:pPr>
       <w:r>
         <w:rPr>
+          <w:rFonts w:ascii="Times New Roman" w:hAnsi="Times New Roman" w:eastAsia="Times New Roman"/>
           <w:b w:val="0"/>
           <w:i w:val="0"/>
+          <w:color w:val="181A1F"/>
+          <w:sz w:val="28"/>
         </w:rPr>
         <w:t xml:space="preserve">3) плата за аренду помещения; </w:t>
       </w:r>
     </w:p>
     <w:p>
+      <w:pPr>
+        <w:widowControl/>
+        <w:spacing w:line="240" w:lineRule="auto" w:after="0"/>
+      </w:pPr>
       <w:r>
         <w:rPr>
+          <w:rFonts w:ascii="Times New Roman" w:hAnsi="Times New Roman" w:eastAsia="Times New Roman"/>
           <w:b w:val="0"/>
           <w:i w:val="0"/>
+          <w:color w:val="181A1F"/>
+          <w:sz w:val="28"/>
         </w:rPr>
         <w:t xml:space="preserve">4) оклады администрации; </w:t>
       </w:r>
     </w:p>
     <w:p>
+      <w:pPr>
+        <w:widowControl/>
+        <w:spacing w:line="240" w:lineRule="auto" w:after="0"/>
+      </w:pPr>
       <w:r>
         <w:rPr>
+          <w:rFonts w:ascii="Times New Roman" w:hAnsi="Times New Roman" w:eastAsia="Times New Roman"/>
           <w:b w:val="0"/>
           <w:i w:val="0"/>
+          <w:color w:val="181A1F"/>
+          <w:sz w:val="28"/>
         </w:rPr>
         <w:t xml:space="preserve">5) сдельная зарплата рабочих; </w:t>
       </w:r>
     </w:p>
     <w:p>
+      <w:pPr>
+        <w:widowControl/>
+        <w:spacing w:line="240" w:lineRule="auto" w:after="0"/>
+      </w:pPr>
       <w:r>
         <w:rPr>
+          <w:rFonts w:ascii="Times New Roman" w:hAnsi="Times New Roman" w:eastAsia="Times New Roman"/>
           <w:b w:val="0"/>
           <w:i w:val="0"/>
+          <w:color w:val="181A1F"/>
+          <w:sz w:val="28"/>
         </w:rPr>
         <w:t>6) плата за транспортные услуги.</w:t>
       </w:r>
     </w:p>
     <w:p>
+      <w:pPr>
+        <w:widowControl/>
+        <w:spacing w:line="240" w:lineRule="auto" w:after="0"/>
+      </w:pPr>
       <w:r>
         <w:rPr>
+          <w:rFonts w:ascii="Times New Roman" w:hAnsi="Times New Roman" w:eastAsia="Times New Roman"/>
           <w:b w:val="0"/>
           <w:i w:val="0"/>
+          <w:color w:val="181A1F"/>
+          <w:sz w:val="28"/>
         </w:rPr>
         <w:t>Найдите два примера, «выпадающих» из общего ряда, и запишите в таблицу цифры, под которыми они указаны.</w:t>
       </w:r>
     </w:p>
     <w:p>
-      <w:r>
-        <w:t>Ответ: ______________________________</w:t>
-      </w:r>
-    </w:p>
-    <w:p>
+      <w:pPr>
+        <w:keepNext/>
+        <w:widowControl/>
+        <w:spacing w:line="240" w:lineRule="auto" w:after="0" w:before="120"/>
+      </w:pPr>
       <w:r>
         <w:rPr>
+          <w:rFonts w:ascii="Times New Roman" w:hAnsi="Times New Roman" w:eastAsia="Times New Roman"/>
           <w:b/>
-          <w:sz w:val="24"/>
+          <w:color w:val="181A1F"/>
+          <w:sz w:val="28"/>
         </w:rPr>
         <w:t>13.</w:t>
       </w:r>
     </w:p>
     <w:p>
+      <w:pPr>
+        <w:widowControl/>
+        <w:spacing w:line="240" w:lineRule="auto" w:after="0"/>
+      </w:pPr>
       <w:r>
         <w:rPr>
+          <w:rFonts w:ascii="Times New Roman" w:hAnsi="Times New Roman" w:eastAsia="Times New Roman"/>
           <w:b w:val="0"/>
           <w:i w:val="0"/>
+          <w:color w:val="181A1F"/>
+          <w:sz w:val="28"/>
         </w:rPr>
         <w:t>Выберите верные суждения о факторах производства и факторных доходах. Запишите цифры, под которыми они указаны.</w:t>
       </w:r>
     </w:p>
     <w:p>
+      <w:pPr>
+        <w:widowControl/>
+        <w:spacing w:line="240" w:lineRule="auto" w:after="0"/>
+      </w:pPr>
       <w:r>
         <w:rPr>
+          <w:rFonts w:ascii="Times New Roman" w:hAnsi="Times New Roman" w:eastAsia="Times New Roman"/>
           <w:b w:val="0"/>
           <w:i w:val="0"/>
+          <w:color w:val="181A1F"/>
+          <w:sz w:val="28"/>
         </w:rPr>
         <w:t>1) Ограниченность труда как фактора производства обусловлена только уровнем экономического и научно-технического развития страны.</w:t>
       </w:r>
     </w:p>
     <w:p>
+      <w:pPr>
+        <w:widowControl/>
+        <w:spacing w:line="240" w:lineRule="auto" w:after="0"/>
+      </w:pPr>
       <w:r>
         <w:rPr>
+          <w:rFonts w:ascii="Times New Roman" w:hAnsi="Times New Roman" w:eastAsia="Times New Roman"/>
           <w:b w:val="0"/>
           <w:i w:val="0"/>
+          <w:color w:val="181A1F"/>
+          <w:sz w:val="28"/>
         </w:rPr>
         <w:t>2) Факторный доход от капитала — заработная плата.</w:t>
       </w:r>
     </w:p>
     <w:p>
+      <w:pPr>
+        <w:widowControl/>
+        <w:spacing w:line="240" w:lineRule="auto" w:after="0"/>
+      </w:pPr>
       <w:r>
         <w:rPr>
+          <w:rFonts w:ascii="Times New Roman" w:hAnsi="Times New Roman" w:eastAsia="Times New Roman"/>
           <w:b w:val="0"/>
           <w:i w:val="0"/>
+          <w:color w:val="181A1F"/>
+          <w:sz w:val="28"/>
         </w:rPr>
         <w:t>3) Предприниматель рискует не только своим временем, трудом и деловой репутацией, но и вложенными средствами.</w:t>
       </w:r>
     </w:p>
     <w:p>
+      <w:pPr>
+        <w:widowControl/>
+        <w:spacing w:line="240" w:lineRule="auto" w:after="0"/>
+      </w:pPr>
       <w:r>
         <w:rPr>
+          <w:rFonts w:ascii="Times New Roman" w:hAnsi="Times New Roman" w:eastAsia="Times New Roman"/>
           <w:b w:val="0"/>
           <w:i w:val="0"/>
+          <w:color w:val="181A1F"/>
+          <w:sz w:val="28"/>
         </w:rPr>
         <w:t>4) Ограниченность земли как фактора производства обусловлена износом зданий, коммуникаций, оборудования, объёмом денежной массы в обращении, уровнем развития страны и фирмы.</w:t>
       </w:r>
     </w:p>
     <w:p>
+      <w:pPr>
+        <w:widowControl/>
+        <w:spacing w:line="240" w:lineRule="auto" w:after="0"/>
+      </w:pPr>
       <w:r>
         <w:rPr>
+          <w:rFonts w:ascii="Times New Roman" w:hAnsi="Times New Roman" w:eastAsia="Times New Roman"/>
           <w:b w:val="0"/>
           <w:i w:val="0"/>
+          <w:color w:val="181A1F"/>
+          <w:sz w:val="28"/>
         </w:rPr>
         <w:t>5) Предпринимательская деятельность в любой сфере регулируется государством через механизм финансовой системы (через налоги, кредиты, страхование и т.п.).</w:t>
       </w:r>
     </w:p>
     <w:p>
-      <w:r>
-        <w:t>Ответ: ______________________________</w:t>
-      </w:r>
-    </w:p>
-    <w:p>
+      <w:pPr>
+        <w:keepNext/>
+        <w:widowControl/>
+        <w:spacing w:line="240" w:lineRule="auto" w:after="0" w:before="120"/>
+      </w:pPr>
       <w:r>
         <w:rPr>
+          <w:rFonts w:ascii="Times New Roman" w:hAnsi="Times New Roman" w:eastAsia="Times New Roman"/>
           <w:b/>
-          <w:sz w:val="24"/>
+          <w:color w:val="181A1F"/>
+          <w:sz w:val="28"/>
         </w:rPr>
         <w:t>14.</w:t>
       </w:r>
     </w:p>
     <w:p>
+      <w:pPr>
+        <w:widowControl/>
+        <w:spacing w:line="240" w:lineRule="auto" w:after="0"/>
+      </w:pPr>
       <w:r>
         <w:rPr>
+          <w:rFonts w:ascii="Times New Roman" w:hAnsi="Times New Roman" w:eastAsia="Times New Roman"/>
           <w:b w:val="0"/>
           <w:i w:val="0"/>
+          <w:color w:val="181A1F"/>
+          <w:sz w:val="28"/>
         </w:rPr>
         <w:t>Установите соответствие между примерами и видами безработицы: к каждой позиции, данной в первом столбце, подберите соответствующую позицию из второго столбца.</w:t>
       </w:r>
@@ -1087,6 +1780,7 @@
       <w:tblPr>
         <w:tblStyle w:val="TableGrid"/>
         <w:tblW w:type="auto" w:w="0"/>
+        <w:tblLayout w:type="autofit"/>
         <w:tblLook w:firstColumn="1" w:firstRow="1" w:lastColumn="0" w:lastRow="0" w:noHBand="0" w:noVBand="1" w:val="04A0"/>
       </w:tblPr>
       <w:tblGrid>
@@ -1099,7 +1793,16 @@
             <w:tcW w:type="dxa" w:w="5128"/>
           </w:tcPr>
           <w:p>
+            <w:pPr>
+              <w:spacing w:after="0" w:line="240" w:lineRule="auto"/>
+            </w:pPr>
             <w:r>
+              <w:rPr>
+                <w:rFonts w:ascii="Times New Roman" w:hAnsi="Times New Roman" w:eastAsia="Times New Roman"/>
+                <w:b/>
+                <w:color w:val="181A1F"/>
+                <w:sz w:val="28"/>
+              </w:rPr>
               <w:t>ПРИМЕРЫ</w:t>
             </w:r>
           </w:p>
@@ -1109,7 +1812,16 @@
             <w:tcW w:type="dxa" w:w="5128"/>
           </w:tcPr>
           <w:p>
+            <w:pPr>
+              <w:spacing w:after="0" w:line="240" w:lineRule="auto"/>
+            </w:pPr>
             <w:r>
+              <w:rPr>
+                <w:rFonts w:ascii="Times New Roman" w:hAnsi="Times New Roman" w:eastAsia="Times New Roman"/>
+                <w:b/>
+                <w:color w:val="181A1F"/>
+                <w:sz w:val="28"/>
+              </w:rPr>
               <w:t>ВИДЫ БЕЗРАБОТИЦЫ</w:t>
             </w:r>
           </w:p>
@@ -1121,8 +1833,24 @@
             <w:tcW w:type="dxa" w:w="5128"/>
           </w:tcPr>
           <w:p>
+            <w:pPr>
+              <w:spacing w:after="0" w:line="240" w:lineRule="auto"/>
+            </w:pPr>
             <w:r>
-              <w:t>А) Металлургический комбинат в связи с экономическим кризисом объявил о сокращении штата сотрудников.Б) После окончания туристического периода часть горничных приморских отелей осталась без работы.В) Группа выпускников престижного вуза отказывается от низкооплачиваемых вакансий на бирже труда и ждёт предложений работы, которая бы их удовлетворила.Г) На производстве электроламповых приборов ввели новые технологии, позволившие оптимизировать производство и сократить численность работников отрасли.Д) Электрогазосварщик вынужден был уволиться из-за переезда в другой город и временно остался без работы.</w:t>
+              <w:rPr>
+                <w:rFonts w:ascii="Times New Roman" w:hAnsi="Times New Roman" w:eastAsia="Times New Roman"/>
+                <w:color w:val="181A1F"/>
+                <w:sz w:val="28"/>
+              </w:rPr>
+              <w:t>А) Металлургический комбинат в связи с экономическим кризисом объявил о сокращении штата сотрудников.</w:t>
+              <w:br/>
+              <w:t>Б) После окончания туристического периода часть горничных приморских отелей осталась без работы.</w:t>
+              <w:br/>
+              <w:t>В) Группа выпускников престижного вуза отказывается от низкооплачиваемых вакансий на бирже труда и ждёт предложений работы, которая бы их удовлетворила.</w:t>
+              <w:br/>
+              <w:t>Г) На производстве электроламповых приборов ввели новые технологии, позволившие оптимизировать производство и сократить численность работников отрасли.</w:t>
+              <w:br/>
+              <w:t>Д) Электрогазосварщик вынужден был уволиться из-за переезда в другой город и временно остался без работы.</w:t>
             </w:r>
           </w:p>
         </w:tc>
@@ -1131,18 +1859,39 @@
             <w:tcW w:type="dxa" w:w="5128"/>
           </w:tcPr>
           <w:p>
+            <w:pPr>
+              <w:spacing w:after="0" w:line="240" w:lineRule="auto"/>
+            </w:pPr>
             <w:r>
-              <w:t>1) циклическая2) структурная3) сезонная4) фрикционная</w:t>
+              <w:rPr>
+                <w:rFonts w:ascii="Times New Roman" w:hAnsi="Times New Roman" w:eastAsia="Times New Roman"/>
+                <w:color w:val="181A1F"/>
+                <w:sz w:val="28"/>
+              </w:rPr>
+              <w:t>1) циклическая</w:t>
+              <w:br/>
+              <w:t>2) структурная</w:t>
+              <w:br/>
+              <w:t>3) сезонная</w:t>
+              <w:br/>
+              <w:t>4) фрикционная</w:t>
             </w:r>
           </w:p>
         </w:tc>
       </w:tr>
     </w:tbl>
     <w:p>
+      <w:pPr>
+        <w:widowControl/>
+        <w:spacing w:line="240" w:lineRule="auto" w:after="0"/>
+      </w:pPr>
       <w:r>
         <w:rPr>
+          <w:rFonts w:ascii="Times New Roman" w:hAnsi="Times New Roman" w:eastAsia="Times New Roman"/>
           <w:b w:val="0"/>
           <w:i w:val="0"/>
+          <w:color w:val="181A1F"/>
+          <w:sz w:val="28"/>
         </w:rPr>
         <w:t>Запишите в ответ цифры, расположив их в порядке, соответствующем буквам:</w:t>
       </w:r>
@@ -1151,6 +1900,7 @@
       <w:tblPr>
         <w:tblStyle w:val="TableGrid"/>
         <w:tblW w:type="auto" w:w="0"/>
+        <w:tblLayout w:type="autofit"/>
         <w:tblLook w:firstColumn="1" w:firstRow="1" w:lastColumn="0" w:lastRow="0" w:noHBand="0" w:noVBand="1" w:val="04A0"/>
       </w:tblPr>
       <w:tblGrid>
@@ -1166,7 +1916,16 @@
             <w:tcW w:type="dxa" w:w="2051"/>
           </w:tcPr>
           <w:p>
+            <w:pPr>
+              <w:spacing w:after="0" w:line="240" w:lineRule="auto"/>
+            </w:pPr>
             <w:r>
+              <w:rPr>
+                <w:rFonts w:ascii="Times New Roman" w:hAnsi="Times New Roman" w:eastAsia="Times New Roman"/>
+                <w:b/>
+                <w:color w:val="181A1F"/>
+                <w:sz w:val="28"/>
+              </w:rPr>
               <w:t>A</w:t>
             </w:r>
           </w:p>
@@ -1176,7 +1935,16 @@
             <w:tcW w:type="dxa" w:w="2051"/>
           </w:tcPr>
           <w:p>
+            <w:pPr>
+              <w:spacing w:after="0" w:line="240" w:lineRule="auto"/>
+            </w:pPr>
             <w:r>
+              <w:rPr>
+                <w:rFonts w:ascii="Times New Roman" w:hAnsi="Times New Roman" w:eastAsia="Times New Roman"/>
+                <w:b/>
+                <w:color w:val="181A1F"/>
+                <w:sz w:val="28"/>
+              </w:rPr>
               <w:t>Б</w:t>
             </w:r>
           </w:p>
@@ -1186,7 +1954,16 @@
             <w:tcW w:type="dxa" w:w="2051"/>
           </w:tcPr>
           <w:p>
+            <w:pPr>
+              <w:spacing w:after="0" w:line="240" w:lineRule="auto"/>
+            </w:pPr>
             <w:r>
+              <w:rPr>
+                <w:rFonts w:ascii="Times New Roman" w:hAnsi="Times New Roman" w:eastAsia="Times New Roman"/>
+                <w:b/>
+                <w:color w:val="181A1F"/>
+                <w:sz w:val="28"/>
+              </w:rPr>
               <w:t>В</w:t>
             </w:r>
           </w:p>
@@ -1196,7 +1973,16 @@
             <w:tcW w:type="dxa" w:w="2051"/>
           </w:tcPr>
           <w:p>
+            <w:pPr>
+              <w:spacing w:after="0" w:line="240" w:lineRule="auto"/>
+            </w:pPr>
             <w:r>
+              <w:rPr>
+                <w:rFonts w:ascii="Times New Roman" w:hAnsi="Times New Roman" w:eastAsia="Times New Roman"/>
+                <w:b/>
+                <w:color w:val="181A1F"/>
+                <w:sz w:val="28"/>
+              </w:rPr>
               <w:t>Г</w:t>
             </w:r>
           </w:p>
@@ -1206,7 +1992,16 @@
             <w:tcW w:type="dxa" w:w="2051"/>
           </w:tcPr>
           <w:p>
+            <w:pPr>
+              <w:spacing w:after="0" w:line="240" w:lineRule="auto"/>
+            </w:pPr>
             <w:r>
+              <w:rPr>
+                <w:rFonts w:ascii="Times New Roman" w:hAnsi="Times New Roman" w:eastAsia="Times New Roman"/>
+                <w:b/>
+                <w:color w:val="181A1F"/>
+                <w:sz w:val="28"/>
+              </w:rPr>
               <w:t>Д</w:t>
             </w:r>
           </w:p>
@@ -1218,7 +2013,16 @@
             <w:tcW w:type="dxa" w:w="2051"/>
           </w:tcPr>
           <w:p>
-            <w:r/>
+            <w:pPr>
+              <w:spacing w:after="0" w:line="240" w:lineRule="auto"/>
+            </w:pPr>
+            <w:r>
+              <w:rPr>
+                <w:rFonts w:ascii="Times New Roman" w:hAnsi="Times New Roman" w:eastAsia="Times New Roman"/>
+                <w:color w:val="181A1F"/>
+                <w:sz w:val="28"/>
+              </w:rPr>
+            </w:r>
           </w:p>
         </w:tc>
         <w:tc>
@@ -1226,7 +2030,16 @@
             <w:tcW w:type="dxa" w:w="2051"/>
           </w:tcPr>
           <w:p>
-            <w:r/>
+            <w:pPr>
+              <w:spacing w:after="0" w:line="240" w:lineRule="auto"/>
+            </w:pPr>
+            <w:r>
+              <w:rPr>
+                <w:rFonts w:ascii="Times New Roman" w:hAnsi="Times New Roman" w:eastAsia="Times New Roman"/>
+                <w:color w:val="181A1F"/>
+                <w:sz w:val="28"/>
+              </w:rPr>
+            </w:r>
           </w:p>
         </w:tc>
         <w:tc>
@@ -1234,7 +2047,16 @@
             <w:tcW w:type="dxa" w:w="2051"/>
           </w:tcPr>
           <w:p>
-            <w:r/>
+            <w:pPr>
+              <w:spacing w:after="0" w:line="240" w:lineRule="auto"/>
+            </w:pPr>
+            <w:r>
+              <w:rPr>
+                <w:rFonts w:ascii="Times New Roman" w:hAnsi="Times New Roman" w:eastAsia="Times New Roman"/>
+                <w:color w:val="181A1F"/>
+                <w:sz w:val="28"/>
+              </w:rPr>
+            </w:r>
           </w:p>
         </w:tc>
         <w:tc>
@@ -1242,7 +2064,16 @@
             <w:tcW w:type="dxa" w:w="2051"/>
           </w:tcPr>
           <w:p>
-            <w:r/>
+            <w:pPr>
+              <w:spacing w:after="0" w:line="240" w:lineRule="auto"/>
+            </w:pPr>
+            <w:r>
+              <w:rPr>
+                <w:rFonts w:ascii="Times New Roman" w:hAnsi="Times New Roman" w:eastAsia="Times New Roman"/>
+                <w:color w:val="181A1F"/>
+                <w:sz w:val="28"/>
+              </w:rPr>
+            </w:r>
           </w:p>
         </w:tc>
         <w:tc>
@@ -1250,98 +2081,160 @@
             <w:tcW w:type="dxa" w:w="2051"/>
           </w:tcPr>
           <w:p>
-            <w:r/>
+            <w:pPr>
+              <w:spacing w:after="0" w:line="240" w:lineRule="auto"/>
+            </w:pPr>
+            <w:r>
+              <w:rPr>
+                <w:rFonts w:ascii="Times New Roman" w:hAnsi="Times New Roman" w:eastAsia="Times New Roman"/>
+                <w:color w:val="181A1F"/>
+                <w:sz w:val="28"/>
+              </w:rPr>
+            </w:r>
           </w:p>
         </w:tc>
       </w:tr>
     </w:tbl>
     <w:p>
-      <w:r>
-        <w:t>Ответ: ______________________________</w:t>
-      </w:r>
-    </w:p>
-    <w:p>
+      <w:pPr>
+        <w:keepNext/>
+        <w:widowControl/>
+        <w:spacing w:line="240" w:lineRule="auto" w:after="0" w:before="120"/>
+      </w:pPr>
       <w:r>
         <w:rPr>
+          <w:rFonts w:ascii="Times New Roman" w:hAnsi="Times New Roman" w:eastAsia="Times New Roman"/>
           <w:b/>
-          <w:sz w:val="24"/>
+          <w:color w:val="181A1F"/>
+          <w:sz w:val="28"/>
         </w:rPr>
         <w:t>15.</w:t>
       </w:r>
     </w:p>
     <w:p>
+      <w:pPr>
+        <w:widowControl/>
+        <w:spacing w:line="240" w:lineRule="auto" w:after="0"/>
+      </w:pPr>
       <w:r>
         <w:rPr>
+          <w:rFonts w:ascii="Times New Roman" w:hAnsi="Times New Roman" w:eastAsia="Times New Roman"/>
           <w:b w:val="0"/>
           <w:i w:val="0"/>
+          <w:color w:val="181A1F"/>
+          <w:sz w:val="28"/>
         </w:rPr>
         <w:t>Выберите верные суждения о налогах и налогообложении и запишите цифры, под которыми они указаны.</w:t>
       </w:r>
     </w:p>
     <w:p>
+      <w:pPr>
+        <w:widowControl/>
+        <w:spacing w:line="240" w:lineRule="auto" w:after="0"/>
+      </w:pPr>
       <w:r>
         <w:rPr>
+          <w:rFonts w:ascii="Times New Roman" w:hAnsi="Times New Roman" w:eastAsia="Times New Roman"/>
           <w:b w:val="0"/>
           <w:i w:val="0"/>
+          <w:color w:val="181A1F"/>
+          <w:sz w:val="28"/>
         </w:rPr>
         <w:t>1) При пропорциональной системе налогообложения ставки увеличиваются при возрастании объекта налога.</w:t>
       </w:r>
     </w:p>
     <w:p>
+      <w:pPr>
+        <w:widowControl/>
+        <w:spacing w:line="240" w:lineRule="auto" w:after="0"/>
+      </w:pPr>
       <w:r>
         <w:rPr>
+          <w:rFonts w:ascii="Times New Roman" w:hAnsi="Times New Roman" w:eastAsia="Times New Roman"/>
           <w:b w:val="0"/>
           <w:i w:val="0"/>
+          <w:color w:val="181A1F"/>
+          <w:sz w:val="28"/>
         </w:rPr>
         <w:t>2) Налоги — обязательные платежи физических и юридических лиц в пользу государства в порядке и на условиях, определённых законодательством.</w:t>
       </w:r>
     </w:p>
     <w:p>
+      <w:pPr>
+        <w:widowControl/>
+        <w:spacing w:line="240" w:lineRule="auto" w:after="0"/>
+      </w:pPr>
       <w:r>
         <w:rPr>
+          <w:rFonts w:ascii="Times New Roman" w:hAnsi="Times New Roman" w:eastAsia="Times New Roman"/>
           <w:b w:val="0"/>
           <w:i w:val="0"/>
+          <w:color w:val="181A1F"/>
+          <w:sz w:val="28"/>
         </w:rPr>
         <w:t>3) Налоги устанавливаются законом и обязательны к уплате.</w:t>
       </w:r>
     </w:p>
     <w:p>
+      <w:pPr>
+        <w:widowControl/>
+        <w:spacing w:line="240" w:lineRule="auto" w:after="0"/>
+      </w:pPr>
       <w:r>
         <w:rPr>
+          <w:rFonts w:ascii="Times New Roman" w:hAnsi="Times New Roman" w:eastAsia="Times New Roman"/>
           <w:b w:val="0"/>
           <w:i w:val="0"/>
+          <w:color w:val="181A1F"/>
+          <w:sz w:val="28"/>
         </w:rPr>
         <w:t>4) Фискальная функция налогов проявляется в наполнении государственного бюджета и финансировании расходов государства.</w:t>
       </w:r>
     </w:p>
     <w:p>
+      <w:pPr>
+        <w:widowControl/>
+        <w:spacing w:line="240" w:lineRule="auto" w:after="0"/>
+      </w:pPr>
       <w:r>
         <w:rPr>
+          <w:rFonts w:ascii="Times New Roman" w:hAnsi="Times New Roman" w:eastAsia="Times New Roman"/>
           <w:b w:val="0"/>
           <w:i w:val="0"/>
+          <w:color w:val="181A1F"/>
+          <w:sz w:val="28"/>
         </w:rPr>
         <w:t>5) К прямым налогам относят налог на добавленную стоимость.</w:t>
       </w:r>
     </w:p>
     <w:p>
-      <w:r>
-        <w:t>Ответ: ______________________________</w:t>
-      </w:r>
-    </w:p>
-    <w:p>
+      <w:pPr>
+        <w:keepNext/>
+        <w:widowControl/>
+        <w:spacing w:line="240" w:lineRule="auto" w:after="0" w:before="120"/>
+      </w:pPr>
       <w:r>
         <w:rPr>
+          <w:rFonts w:ascii="Times New Roman" w:hAnsi="Times New Roman" w:eastAsia="Times New Roman"/>
           <w:b/>
-          <w:sz w:val="24"/>
+          <w:color w:val="181A1F"/>
+          <w:sz w:val="28"/>
         </w:rPr>
         <w:t>16.</w:t>
       </w:r>
     </w:p>
     <w:p>
+      <w:pPr>
+        <w:widowControl/>
+        <w:spacing w:line="240" w:lineRule="auto" w:after="0"/>
+      </w:pPr>
       <w:r>
         <w:rPr>
+          <w:rFonts w:ascii="Times New Roman" w:hAnsi="Times New Roman" w:eastAsia="Times New Roman"/>
           <w:b w:val="0"/>
           <w:i w:val="0"/>
+          <w:color w:val="181A1F"/>
+          <w:sz w:val="28"/>
         </w:rPr>
         <w:t>Установите соответствие между признаками и принципами международной торговли: к каждой позиции, данной в первом столбце, подберите соответствующую позицию из второго столбца.</w:t>
       </w:r>
@@ -1350,6 +2243,7 @@
       <w:tblPr>
         <w:tblStyle w:val="TableGrid"/>
         <w:tblW w:type="auto" w:w="0"/>
+        <w:tblLayout w:type="autofit"/>
         <w:tblLook w:firstColumn="1" w:firstRow="1" w:lastColumn="0" w:lastRow="0" w:noHBand="0" w:noVBand="1" w:val="04A0"/>
       </w:tblPr>
       <w:tblGrid>
@@ -1362,7 +2256,16 @@
             <w:tcW w:type="dxa" w:w="5128"/>
           </w:tcPr>
           <w:p>
+            <w:pPr>
+              <w:spacing w:after="0" w:line="240" w:lineRule="auto"/>
+            </w:pPr>
             <w:r>
+              <w:rPr>
+                <w:rFonts w:ascii="Times New Roman" w:hAnsi="Times New Roman" w:eastAsia="Times New Roman"/>
+                <w:b/>
+                <w:color w:val="181A1F"/>
+                <w:sz w:val="28"/>
+              </w:rPr>
               <w:t>ПРИЗНАКИ</w:t>
             </w:r>
           </w:p>
@@ -1372,7 +2275,16 @@
             <w:tcW w:type="dxa" w:w="5128"/>
           </w:tcPr>
           <w:p>
+            <w:pPr>
+              <w:spacing w:after="0" w:line="240" w:lineRule="auto"/>
+            </w:pPr>
             <w:r>
+              <w:rPr>
+                <w:rFonts w:ascii="Times New Roman" w:hAnsi="Times New Roman" w:eastAsia="Times New Roman"/>
+                <w:b/>
+                <w:color w:val="181A1F"/>
+                <w:sz w:val="28"/>
+              </w:rPr>
               <w:t>ПРИНЦИПЫ МЕЖДУНАРОДНОЙ ТОРГОВЛИ</w:t>
             </w:r>
           </w:p>
@@ -1384,8 +2296,24 @@
             <w:tcW w:type="dxa" w:w="5128"/>
           </w:tcPr>
           <w:p>
+            <w:pPr>
+              <w:spacing w:after="0" w:line="240" w:lineRule="auto"/>
+            </w:pPr>
             <w:r>
-              <w:t>А) беспошлинная торговляБ) высокие таможенные пошлиныВ) импортные квотыГ) максимальное использование международной специализацииД) внешнеторговые лицензии</w:t>
+              <w:rPr>
+                <w:rFonts w:ascii="Times New Roman" w:hAnsi="Times New Roman" w:eastAsia="Times New Roman"/>
+                <w:color w:val="181A1F"/>
+                <w:sz w:val="28"/>
+              </w:rPr>
+              <w:t>А) беспошлинная торговля</w:t>
+              <w:br/>
+              <w:t>Б) высокие таможенные пошлины</w:t>
+              <w:br/>
+              <w:t>В) импортные квоты</w:t>
+              <w:br/>
+              <w:t>Г) максимальное использование международной специализации</w:t>
+              <w:br/>
+              <w:t>Д) внешнеторговые лицензии</w:t>
             </w:r>
           </w:p>
         </w:tc>
@@ -1394,18 +2322,35 @@
             <w:tcW w:type="dxa" w:w="5128"/>
           </w:tcPr>
           <w:p>
+            <w:pPr>
+              <w:spacing w:after="0" w:line="240" w:lineRule="auto"/>
+            </w:pPr>
             <w:r>
-              <w:t>1) свободная торговля2) протекционизм</w:t>
+              <w:rPr>
+                <w:rFonts w:ascii="Times New Roman" w:hAnsi="Times New Roman" w:eastAsia="Times New Roman"/>
+                <w:color w:val="181A1F"/>
+                <w:sz w:val="28"/>
+              </w:rPr>
+              <w:t>1) свободная торговля</w:t>
+              <w:br/>
+              <w:t>2) протекционизм</w:t>
             </w:r>
           </w:p>
         </w:tc>
       </w:tr>
     </w:tbl>
     <w:p>
+      <w:pPr>
+        <w:widowControl/>
+        <w:spacing w:line="240" w:lineRule="auto" w:after="0"/>
+      </w:pPr>
       <w:r>
         <w:rPr>
+          <w:rFonts w:ascii="Times New Roman" w:hAnsi="Times New Roman" w:eastAsia="Times New Roman"/>
           <w:b w:val="0"/>
           <w:i w:val="0"/>
+          <w:color w:val="181A1F"/>
+          <w:sz w:val="28"/>
         </w:rPr>
         <w:t>Запишите в ответ цифры, расположив их в порядке, соответствующем буквам:</w:t>
       </w:r>
@@ -1414,6 +2359,7 @@
       <w:tblPr>
         <w:tblStyle w:val="TableGrid"/>
         <w:tblW w:type="auto" w:w="0"/>
+        <w:tblLayout w:type="autofit"/>
         <w:tblLook w:firstColumn="1" w:firstRow="1" w:lastColumn="0" w:lastRow="0" w:noHBand="0" w:noVBand="1" w:val="04A0"/>
       </w:tblPr>
       <w:tblGrid>
@@ -1429,7 +2375,16 @@
             <w:tcW w:type="dxa" w:w="2051"/>
           </w:tcPr>
           <w:p>
+            <w:pPr>
+              <w:spacing w:after="0" w:line="240" w:lineRule="auto"/>
+            </w:pPr>
             <w:r>
+              <w:rPr>
+                <w:rFonts w:ascii="Times New Roman" w:hAnsi="Times New Roman" w:eastAsia="Times New Roman"/>
+                <w:b/>
+                <w:color w:val="181A1F"/>
+                <w:sz w:val="28"/>
+              </w:rPr>
               <w:t>A</w:t>
             </w:r>
           </w:p>
@@ -1439,7 +2394,16 @@
             <w:tcW w:type="dxa" w:w="2051"/>
           </w:tcPr>
           <w:p>
+            <w:pPr>
+              <w:spacing w:after="0" w:line="240" w:lineRule="auto"/>
+            </w:pPr>
             <w:r>
+              <w:rPr>
+                <w:rFonts w:ascii="Times New Roman" w:hAnsi="Times New Roman" w:eastAsia="Times New Roman"/>
+                <w:b/>
+                <w:color w:val="181A1F"/>
+                <w:sz w:val="28"/>
+              </w:rPr>
               <w:t>Б</w:t>
             </w:r>
           </w:p>
@@ -1449,7 +2413,16 @@
             <w:tcW w:type="dxa" w:w="2051"/>
           </w:tcPr>
           <w:p>
+            <w:pPr>
+              <w:spacing w:after="0" w:line="240" w:lineRule="auto"/>
+            </w:pPr>
             <w:r>
+              <w:rPr>
+                <w:rFonts w:ascii="Times New Roman" w:hAnsi="Times New Roman" w:eastAsia="Times New Roman"/>
+                <w:b/>
+                <w:color w:val="181A1F"/>
+                <w:sz w:val="28"/>
+              </w:rPr>
               <w:t>В</w:t>
             </w:r>
           </w:p>
@@ -1459,7 +2432,16 @@
             <w:tcW w:type="dxa" w:w="2051"/>
           </w:tcPr>
           <w:p>
+            <w:pPr>
+              <w:spacing w:after="0" w:line="240" w:lineRule="auto"/>
+            </w:pPr>
             <w:r>
+              <w:rPr>
+                <w:rFonts w:ascii="Times New Roman" w:hAnsi="Times New Roman" w:eastAsia="Times New Roman"/>
+                <w:b/>
+                <w:color w:val="181A1F"/>
+                <w:sz w:val="28"/>
+              </w:rPr>
               <w:t>Г</w:t>
             </w:r>
           </w:p>
@@ -1469,7 +2451,16 @@
             <w:tcW w:type="dxa" w:w="2051"/>
           </w:tcPr>
           <w:p>
+            <w:pPr>
+              <w:spacing w:after="0" w:line="240" w:lineRule="auto"/>
+            </w:pPr>
             <w:r>
+              <w:rPr>
+                <w:rFonts w:ascii="Times New Roman" w:hAnsi="Times New Roman" w:eastAsia="Times New Roman"/>
+                <w:b/>
+                <w:color w:val="181A1F"/>
+                <w:sz w:val="28"/>
+              </w:rPr>
               <w:t>Д</w:t>
             </w:r>
           </w:p>
@@ -1481,7 +2472,16 @@
             <w:tcW w:type="dxa" w:w="2051"/>
           </w:tcPr>
           <w:p>
-            <w:r/>
+            <w:pPr>
+              <w:spacing w:after="0" w:line="240" w:lineRule="auto"/>
+            </w:pPr>
+            <w:r>
+              <w:rPr>
+                <w:rFonts w:ascii="Times New Roman" w:hAnsi="Times New Roman" w:eastAsia="Times New Roman"/>
+                <w:color w:val="181A1F"/>
+                <w:sz w:val="28"/>
+              </w:rPr>
+            </w:r>
           </w:p>
         </w:tc>
         <w:tc>
@@ -1489,7 +2489,16 @@
             <w:tcW w:type="dxa" w:w="2051"/>
           </w:tcPr>
           <w:p>
-            <w:r/>
+            <w:pPr>
+              <w:spacing w:after="0" w:line="240" w:lineRule="auto"/>
+            </w:pPr>
+            <w:r>
+              <w:rPr>
+                <w:rFonts w:ascii="Times New Roman" w:hAnsi="Times New Roman" w:eastAsia="Times New Roman"/>
+                <w:color w:val="181A1F"/>
+                <w:sz w:val="28"/>
+              </w:rPr>
+            </w:r>
           </w:p>
         </w:tc>
         <w:tc>
@@ -1497,7 +2506,16 @@
             <w:tcW w:type="dxa" w:w="2051"/>
           </w:tcPr>
           <w:p>
-            <w:r/>
+            <w:pPr>
+              <w:spacing w:after="0" w:line="240" w:lineRule="auto"/>
+            </w:pPr>
+            <w:r>
+              <w:rPr>
+                <w:rFonts w:ascii="Times New Roman" w:hAnsi="Times New Roman" w:eastAsia="Times New Roman"/>
+                <w:color w:val="181A1F"/>
+                <w:sz w:val="28"/>
+              </w:rPr>
+            </w:r>
           </w:p>
         </w:tc>
         <w:tc>
@@ -1505,7 +2523,16 @@
             <w:tcW w:type="dxa" w:w="2051"/>
           </w:tcPr>
           <w:p>
-            <w:r/>
+            <w:pPr>
+              <w:spacing w:after="0" w:line="240" w:lineRule="auto"/>
+            </w:pPr>
+            <w:r>
+              <w:rPr>
+                <w:rFonts w:ascii="Times New Roman" w:hAnsi="Times New Roman" w:eastAsia="Times New Roman"/>
+                <w:color w:val="181A1F"/>
+                <w:sz w:val="28"/>
+              </w:rPr>
+            </w:r>
           </w:p>
         </w:tc>
         <w:tc>
@@ -1513,315 +2540,503 @@
             <w:tcW w:type="dxa" w:w="2051"/>
           </w:tcPr>
           <w:p>
-            <w:r/>
+            <w:pPr>
+              <w:spacing w:after="0" w:line="240" w:lineRule="auto"/>
+            </w:pPr>
+            <w:r>
+              <w:rPr>
+                <w:rFonts w:ascii="Times New Roman" w:hAnsi="Times New Roman" w:eastAsia="Times New Roman"/>
+                <w:color w:val="181A1F"/>
+                <w:sz w:val="28"/>
+              </w:rPr>
+            </w:r>
           </w:p>
         </w:tc>
       </w:tr>
     </w:tbl>
     <w:p>
+      <w:pPr>
+        <w:widowControl/>
+        <w:spacing w:line="240" w:lineRule="auto" w:after="0"/>
+      </w:pPr>
       <w:r>
-        <w:t>Ответ: ______________________________</w:t>
-      </w:r>
-    </w:p>
-    <w:p>
-      <w:r>
+        <w:rPr>
+          <w:rFonts w:ascii="Times New Roman" w:hAnsi="Times New Roman" w:eastAsia="Times New Roman"/>
+          <w:color w:val="181A1F"/>
+          <w:sz w:val="28"/>
+        </w:rPr>
         <w:br w:type="page"/>
       </w:r>
     </w:p>
     <w:p>
       <w:pPr>
         <w:pStyle w:val="Heading1"/>
+        <w:keepNext/>
+        <w:widowControl/>
+        <w:spacing w:line="240" w:lineRule="auto" w:after="60" w:before="160"/>
       </w:pPr>
       <w:r>
+        <w:rPr>
+          <w:rFonts w:ascii="Times New Roman" w:hAnsi="Times New Roman" w:eastAsia="Times New Roman"/>
+          <w:b/>
+          <w:color w:val="181A1F"/>
+          <w:sz w:val="28"/>
+        </w:rPr>
         <w:t>Часть 2</w:t>
       </w:r>
     </w:p>
     <w:p>
+      <w:pPr>
+        <w:widowControl/>
+        <w:spacing w:line="240" w:lineRule="auto" w:after="0"/>
+      </w:pPr>
       <w:r>
+        <w:rPr>
+          <w:rFonts w:ascii="Times New Roman" w:hAnsi="Times New Roman" w:eastAsia="Times New Roman"/>
+          <w:color w:val="181A1F"/>
+          <w:sz w:val="28"/>
+        </w:rPr>
         <w:t>Для заданий 17–25 запишите полный развёрнутый ответ. Каждый вопрос самодостаточен и тематически соответствует варианту.</w:t>
       </w:r>
     </w:p>
     <w:p>
+      <w:pPr>
+        <w:keepNext/>
+        <w:widowControl/>
+        <w:spacing w:line="240" w:lineRule="auto" w:after="0" w:before="120"/>
+      </w:pPr>
       <w:r>
         <w:rPr>
+          <w:rFonts w:ascii="Times New Roman" w:hAnsi="Times New Roman" w:eastAsia="Times New Roman"/>
           <w:b/>
-          <w:sz w:val="24"/>
+          <w:color w:val="181A1F"/>
+          <w:sz w:val="28"/>
         </w:rPr>
         <w:t>17.</w:t>
       </w:r>
     </w:p>
     <w:p>
+      <w:pPr>
+        <w:widowControl/>
+        <w:spacing w:line="240" w:lineRule="auto" w:after="0"/>
+      </w:pPr>
       <w:r>
         <w:rPr>
+          <w:rFonts w:ascii="Times New Roman" w:hAnsi="Times New Roman" w:eastAsia="Times New Roman"/>
           <w:b w:val="0"/>
           <w:i w:val="0"/>
+          <w:color w:val="181A1F"/>
+          <w:sz w:val="28"/>
         </w:rPr>
         <w:t>Что должно быть приоритетом для нас? Считаю главным, ключевым фактором развития благополучие людей, достаток в российских семьях.</w:t>
       </w:r>
     </w:p>
     <w:p>
+      <w:pPr>
+        <w:widowControl/>
+        <w:spacing w:line="240" w:lineRule="auto" w:after="0"/>
+      </w:pPr>
       <w:r>
         <w:rPr>
+          <w:rFonts w:ascii="Times New Roman" w:hAnsi="Times New Roman" w:eastAsia="Times New Roman"/>
           <w:b w:val="0"/>
           <w:i w:val="0"/>
+          <w:color w:val="181A1F"/>
+          <w:sz w:val="28"/>
         </w:rPr>
         <w:t>В 2000 году за чертой бедности находились 42 миллиона человек, это почти 30% населения страны. В 2012 году нам удалось снизить этот уровень до 10%. Из-за последствий экономического кризиса бедность вновь подросла. Сегодня с ней сталкиваются 20 миллионов граждан. Конечно, это не 42 миллиона, как было в 2000-м, но тоже недопустимо много. Даже некоторые работающие люди живут очень скромно. Мы впервые в новейшей истории смогли приравнять минимальный размер оплаты труда к прожиточному минимуму, что позитивно скажется на доходах около четырёх миллионов человек.</w:t>
       </w:r>
     </w:p>
     <w:p>
+      <w:pPr>
+        <w:widowControl/>
+        <w:spacing w:line="240" w:lineRule="auto" w:after="0"/>
+      </w:pPr>
       <w:r>
         <w:rPr>
+          <w:rFonts w:ascii="Times New Roman" w:hAnsi="Times New Roman" w:eastAsia="Times New Roman"/>
           <w:b w:val="0"/>
           <w:i w:val="0"/>
+          <w:color w:val="181A1F"/>
+          <w:sz w:val="28"/>
         </w:rPr>
         <w:t>Нам необходимо: серьёзно обновить структуру занятости, которая сегодня во многом неэффективна и архаична; дать людям хорошую работу, которая мотивирует, приносит достаток, позволяет реализовать себя; создать современные, достойно оплачиваемые рабочие места. На этой основе мы должны решить одну из ключевых задач на предстоящее десятилетие – обеспечить уверенный, долгосрочный рост реальных доходов граждан, а за шесть лет как минимум вдвое снизить уровень бедности…</w:t>
       </w:r>
     </w:p>
     <w:p>
+      <w:pPr>
+        <w:widowControl/>
+        <w:spacing w:line="240" w:lineRule="auto" w:after="0"/>
+      </w:pPr>
       <w:r>
         <w:rPr>
+          <w:rFonts w:ascii="Times New Roman" w:hAnsi="Times New Roman" w:eastAsia="Times New Roman"/>
           <w:b w:val="0"/>
           <w:i w:val="0"/>
+          <w:color w:val="181A1F"/>
+          <w:sz w:val="28"/>
         </w:rPr>
         <w:t>В предыдущие годы за счёт активной поддержки семьи, материнства, детства мы смогли переломить негативные демографические тенденции: добились роста рождаемости и снижения смертности, сумели сгладить последствия двух тяжелейших, наложившихся друг на друга демографических провалов периода Великой Отечественной войны и конца прошлого века… Но сегодня демографические потери 90-х неминуемо дают о себе знать. Это прежде всего снижение рождаемости, так как семьи начинает создавать малочисленное поколение 90-х годов…</w:t>
       </w:r>
     </w:p>
     <w:p>
+      <w:pPr>
+        <w:widowControl/>
+        <w:spacing w:line="240" w:lineRule="auto" w:after="0"/>
+      </w:pPr>
       <w:r>
         <w:rPr>
+          <w:rFonts w:ascii="Times New Roman" w:hAnsi="Times New Roman" w:eastAsia="Times New Roman"/>
           <w:b w:val="0"/>
           <w:i w:val="0"/>
+          <w:color w:val="181A1F"/>
+          <w:sz w:val="28"/>
         </w:rPr>
         <w:t>У демографической проблемы есть и экономическое измерение. В 2017 году, например, численность населения в трудоспособном возрасте сократилась почти на миллион. В ближайшие годы такая тенденция к сокращению сохранится, что может стать серьёзным ограничением для экономического роста…</w:t>
       </w:r>
     </w:p>
     <w:p>
+      <w:pPr>
+        <w:widowControl/>
+        <w:spacing w:line="240" w:lineRule="auto" w:after="0"/>
+      </w:pPr>
       <w:r>
         <w:rPr>
+          <w:rFonts w:ascii="Times New Roman" w:hAnsi="Times New Roman" w:eastAsia="Times New Roman"/>
           <w:b w:val="0"/>
           <w:i w:val="0"/>
+          <w:color w:val="181A1F"/>
+          <w:sz w:val="28"/>
         </w:rPr>
         <w:t>Наша демографическая политика доказала свою результативность.</w:t>
       </w:r>
     </w:p>
     <w:p>
+      <w:pPr>
+        <w:widowControl/>
+        <w:spacing w:line="240" w:lineRule="auto" w:after="0"/>
+      </w:pPr>
       <w:r>
         <w:rPr>
+          <w:rFonts w:ascii="Times New Roman" w:hAnsi="Times New Roman" w:eastAsia="Times New Roman"/>
           <w:b w:val="0"/>
           <w:i w:val="0"/>
+          <w:color w:val="181A1F"/>
+          <w:sz w:val="28"/>
         </w:rPr>
         <w:t>И мы продолжили, расширили её. Продлили программу материнского капитала, предусмотрели адресные выплаты при рождении первенца, второго и третьего ребёнка. За пять лет свыше полумиллиона семей с детьми смогут улучшить свои жилищные условия с помощью льготной ипотеки. Также запускается программа обновления детских поликлиник и детских поликлинических отделений в больницах…</w:t>
       </w:r>
     </w:p>
     <w:p>
+      <w:pPr>
+        <w:widowControl/>
+        <w:spacing w:line="240" w:lineRule="auto" w:after="0"/>
+      </w:pPr>
       <w:r>
         <w:rPr>
+          <w:rFonts w:ascii="Times New Roman" w:hAnsi="Times New Roman" w:eastAsia="Times New Roman"/>
           <w:b w:val="0"/>
           <w:i w:val="0"/>
+          <w:color w:val="181A1F"/>
+          <w:sz w:val="28"/>
         </w:rPr>
         <w:t>Россия должна не только прочно закрепиться в пятёрке крупнейших экономик мира, но и к середине следующего десятилетия увеличить ВВП на душу населения в полтора раза. Это очень сложная задача. Уверен, мы готовы эту задачу решить…</w:t>
       </w:r>
     </w:p>
     <w:p>
+      <w:pPr>
+        <w:widowControl/>
+        <w:spacing w:line="240" w:lineRule="auto" w:after="0"/>
+      </w:pPr>
       <w:r>
         <w:rPr>
+          <w:rFonts w:ascii="Times New Roman" w:hAnsi="Times New Roman" w:eastAsia="Times New Roman"/>
           <w:b w:val="0"/>
           <w:i w:val="0"/>
+          <w:color w:val="181A1F"/>
+          <w:sz w:val="28"/>
         </w:rPr>
         <w:t xml:space="preserve"> (В.В. Путин)</w:t>
       </w:r>
     </w:p>
     <w:p>
+      <w:pPr>
+        <w:widowControl/>
+        <w:spacing w:line="240" w:lineRule="auto" w:after="0"/>
+      </w:pPr>
       <w:r>
         <w:rPr>
+          <w:rFonts w:ascii="Times New Roman" w:hAnsi="Times New Roman" w:eastAsia="Times New Roman"/>
           <w:b w:val="0"/>
           <w:i w:val="0"/>
+          <w:color w:val="181A1F"/>
+          <w:sz w:val="28"/>
         </w:rPr>
         <w:t>Какой фактор развития автор считает ключевым? Как он формулирует цели (задачи) развития страны? (Назовите любые три цели (задачи) из текста.) Какие меры демографической политики обозначены в тексте? (Укажите любые две меры.)</w:t>
       </w:r>
     </w:p>
     <w:p>
+      <w:pPr>
+        <w:widowControl/>
+        <w:spacing w:line="240" w:lineRule="auto" w:after="0"/>
+      </w:pPr>
       <w:r>
+        <w:rPr>
+          <w:rFonts w:ascii="Times New Roman" w:hAnsi="Times New Roman" w:eastAsia="Times New Roman"/>
+          <w:color w:val="181A1F"/>
+          <w:sz w:val="28"/>
+        </w:rPr>
         <w:t>Ответ:</w:t>
       </w:r>
     </w:p>
     <w:p>
-      <w:r>
-        <w:t>__________________________________________________________________________________________</w:t>
-      </w:r>
-    </w:p>
-    <w:p>
-      <w:r>
-        <w:t>__________________________________________________________________________________________</w:t>
-      </w:r>
-    </w:p>
-    <w:p>
-      <w:r>
-        <w:t>__________________________________________________________________________________________</w:t>
-      </w:r>
-    </w:p>
-    <w:p>
+      <w:pPr>
+        <w:keepNext/>
+        <w:widowControl/>
+        <w:spacing w:line="240" w:lineRule="auto" w:after="0" w:before="120"/>
+      </w:pPr>
       <w:r>
         <w:rPr>
+          <w:rFonts w:ascii="Times New Roman" w:hAnsi="Times New Roman" w:eastAsia="Times New Roman"/>
           <w:b/>
-          <w:sz w:val="24"/>
+          <w:color w:val="181A1F"/>
+          <w:sz w:val="28"/>
         </w:rPr>
         <w:t>18.</w:t>
       </w:r>
     </w:p>
     <w:p>
+      <w:pPr>
+        <w:widowControl/>
+        <w:spacing w:line="240" w:lineRule="auto" w:after="0"/>
+      </w:pPr>
       <w:r>
         <w:rPr>
+          <w:rFonts w:ascii="Times New Roman" w:hAnsi="Times New Roman" w:eastAsia="Times New Roman"/>
           <w:b w:val="0"/>
           <w:i w:val="0"/>
+          <w:color w:val="181A1F"/>
+          <w:sz w:val="28"/>
         </w:rPr>
         <w:t>Постиндустриальная теория условно делит всю историю человечества на три большие эпохи, соответствующие обществам доиндустриальному (традиционному), индустриальному и постиндустриальному. В логике этой теории доиндустриальное общество базируется на взаимодействиях индивидов с природой, индустриальное — на взаимодействиях индивидов с преобразованной ими природой, в частности с техникой, искусственно созданными ландшафтами, зданиями и сооружениями, а постиндустриальное общество — на взаимодействиях между индивидами.</w:t>
       </w:r>
     </w:p>
     <w:p>
+      <w:pPr>
+        <w:widowControl/>
+        <w:spacing w:line="240" w:lineRule="auto" w:after="0"/>
+      </w:pPr>
       <w:r>
         <w:rPr>
+          <w:rFonts w:ascii="Times New Roman" w:hAnsi="Times New Roman" w:eastAsia="Times New Roman"/>
           <w:b w:val="0"/>
           <w:i w:val="0"/>
+          <w:color w:val="181A1F"/>
+          <w:sz w:val="28"/>
         </w:rPr>
         <w:t>В доиндустриальном обществе основным типом производственной деятельности является добыча и изготовление продуктов, в индустриальном — последовательная обработка сырья и продуктов для получения окончательного продукта, в постиндустриальном к последовательной обработке добавляется высокий уровень автоматизации производства.</w:t>
       </w:r>
     </w:p>
     <w:p>
+      <w:pPr>
+        <w:widowControl/>
+        <w:spacing w:line="240" w:lineRule="auto" w:after="0"/>
+      </w:pPr>
       <w:r>
         <w:rPr>
+          <w:rFonts w:ascii="Times New Roman" w:hAnsi="Times New Roman" w:eastAsia="Times New Roman"/>
           <w:b w:val="0"/>
           <w:i w:val="0"/>
+          <w:color w:val="181A1F"/>
+          <w:sz w:val="28"/>
         </w:rPr>
         <w:t>Наиболее распространённый тип экономической деятельности в доиндустриальном обществе — натуральное хозяйство или ручное производство продуктов, в индустриальном обществе — крупное машинное производство, а в постиндустриальном обществе — предоставление разнообразных услуг.</w:t>
       </w:r>
     </w:p>
     <w:p>
+      <w:pPr>
+        <w:widowControl/>
+        <w:spacing w:line="240" w:lineRule="auto" w:after="0"/>
+      </w:pPr>
       <w:r>
         <w:rPr>
+          <w:rFonts w:ascii="Times New Roman" w:hAnsi="Times New Roman" w:eastAsia="Times New Roman"/>
           <w:b w:val="0"/>
           <w:i w:val="0"/>
+          <w:color w:val="181A1F"/>
+          <w:sz w:val="28"/>
         </w:rPr>
         <w:t>Каждый последующий этап развития экономики не отменяет, включает предыдущие. Новые экономические уклады всегда формировались внутри предшествующих, то есть производство благ, менее зависимых от природной среды, постепенно обретало товарные формы и становилось всё более значимым в общем объеме валового внутреннего продукта. Переход к следующему этапу экономического развития происходил, когда доля этого нового экономического уклада начинала доминировать. Но предшествующие экономические уклады не исчезали полностью из структуры экономики. Поэтому постиндустриальная экономика включает индустриальные отрасли и сельское хозяйство, обеспечивающие материальную основу развития общества и государства.</w:t>
       </w:r>
     </w:p>
     <w:p>
+      <w:pPr>
+        <w:widowControl/>
+        <w:spacing w:line="240" w:lineRule="auto" w:after="0"/>
+      </w:pPr>
       <w:r>
         <w:rPr>
+          <w:rFonts w:ascii="Times New Roman" w:hAnsi="Times New Roman" w:eastAsia="Times New Roman"/>
           <w:b w:val="0"/>
           <w:i w:val="0"/>
+          <w:color w:val="181A1F"/>
+          <w:sz w:val="28"/>
         </w:rPr>
         <w:t>Но в постиндустриальной экономике решающими условиями достижения успеха становятся информация и знания, высокий уровень автоматизации производства, наукоёмкие технологии, предоставление услуг, среди которых постоянно появляются и развиваются новые, отсутствовавшие на ранних этапах развития общества. Поэтому эти сферы экономики более приоритетны для развития постиндустриального общества, чем сфера материального производства.</w:t>
       </w:r>
     </w:p>
     <w:p>
+      <w:pPr>
+        <w:widowControl/>
+        <w:spacing w:line="240" w:lineRule="auto" w:after="0"/>
+      </w:pPr>
       <w:r>
         <w:rPr>
+          <w:rFonts w:ascii="Times New Roman" w:hAnsi="Times New Roman" w:eastAsia="Times New Roman"/>
           <w:b w:val="0"/>
           <w:i w:val="0"/>
+          <w:color w:val="181A1F"/>
+          <w:sz w:val="28"/>
         </w:rPr>
         <w:t>Постиндустриальное общество, в том числе и через экономическую</w:t>
       </w:r>
     </w:p>
     <w:p>
+      <w:pPr>
+        <w:widowControl/>
+        <w:spacing w:line="240" w:lineRule="auto" w:after="0"/>
+      </w:pPr>
       <w:r>
         <w:rPr>
+          <w:rFonts w:ascii="Times New Roman" w:hAnsi="Times New Roman" w:eastAsia="Times New Roman"/>
           <w:b w:val="0"/>
           <w:i w:val="0"/>
+          <w:color w:val="181A1F"/>
+          <w:sz w:val="28"/>
         </w:rPr>
         <w:t>деятельность, стимулирует и развивает стремление индивидов к саморазвитию, к реализации своих способностей и качеств. (По В.Л. Римскому)</w:t>
       </w:r>
     </w:p>
     <w:p>
+      <w:pPr>
+        <w:widowControl/>
+        <w:spacing w:line="240" w:lineRule="auto" w:after="0"/>
+      </w:pPr>
       <w:r>
         <w:rPr>
+          <w:rFonts w:ascii="Times New Roman" w:hAnsi="Times New Roman" w:eastAsia="Times New Roman"/>
           <w:b w:val="0"/>
           <w:i w:val="0"/>
+          <w:color w:val="181A1F"/>
+          <w:sz w:val="28"/>
         </w:rPr>
         <w:t>На каких взаимодействиях базируется индустриальное общество? Как изменяются типы производственной деятельности при переходе от доиндустриального общества к индустриальному? Как происходит преемственность этапов экономического развития? (Ответы на все вопросы даются только с опорой на текст.)</w:t>
       </w:r>
     </w:p>
     <w:p>
+      <w:pPr>
+        <w:widowControl/>
+        <w:spacing w:line="240" w:lineRule="auto" w:after="0"/>
+      </w:pPr>
       <w:r>
+        <w:rPr>
+          <w:rFonts w:ascii="Times New Roman" w:hAnsi="Times New Roman" w:eastAsia="Times New Roman"/>
+          <w:color w:val="181A1F"/>
+          <w:sz w:val="28"/>
+        </w:rPr>
         <w:t>Ответ:</w:t>
       </w:r>
     </w:p>
     <w:p>
-      <w:r>
-        <w:t>__________________________________________________________________________________________</w:t>
-      </w:r>
-    </w:p>
-    <w:p>
-      <w:r>
-        <w:t>__________________________________________________________________________________________</w:t>
-      </w:r>
-    </w:p>
-    <w:p>
-      <w:r>
-        <w:t>__________________________________________________________________________________________</w:t>
-      </w:r>
-    </w:p>
-    <w:p>
+      <w:pPr>
+        <w:keepNext/>
+        <w:widowControl/>
+        <w:spacing w:line="240" w:lineRule="auto" w:after="0" w:before="120"/>
+      </w:pPr>
       <w:r>
         <w:rPr>
+          <w:rFonts w:ascii="Times New Roman" w:hAnsi="Times New Roman" w:eastAsia="Times New Roman"/>
           <w:b/>
-          <w:sz w:val="24"/>
+          <w:color w:val="181A1F"/>
+          <w:sz w:val="28"/>
         </w:rPr>
         <w:t>19.</w:t>
       </w:r>
     </w:p>
     <w:p>
+      <w:pPr>
+        <w:widowControl/>
+        <w:spacing w:line="240" w:lineRule="auto" w:after="0"/>
+      </w:pPr>
       <w:r>
         <w:rPr>
+          <w:rFonts w:ascii="Times New Roman" w:hAnsi="Times New Roman" w:eastAsia="Times New Roman"/>
           <w:b w:val="0"/>
           <w:i w:val="0"/>
+          <w:color w:val="181A1F"/>
+          <w:sz w:val="28"/>
         </w:rPr>
         <w:t>Используя обществоведческие знания, приведите три способа инвестирования для сохранения денег и поясните риски каждого из них.(Каждое суждение должно быть сформулировано как развернутое предложение).</w:t>
       </w:r>
     </w:p>
     <w:p>
+      <w:pPr>
+        <w:widowControl/>
+        <w:spacing w:line="240" w:lineRule="auto" w:after="0"/>
+      </w:pPr>
       <w:r>
+        <w:rPr>
+          <w:rFonts w:ascii="Times New Roman" w:hAnsi="Times New Roman" w:eastAsia="Times New Roman"/>
+          <w:color w:val="181A1F"/>
+          <w:sz w:val="28"/>
+        </w:rPr>
         <w:t>Ответ:</w:t>
       </w:r>
     </w:p>
     <w:p>
-      <w:r>
-        <w:t>__________________________________________________________________________________________</w:t>
-      </w:r>
-    </w:p>
-    <w:p>
-      <w:r>
-        <w:t>__________________________________________________________________________________________</w:t>
-      </w:r>
-    </w:p>
-    <w:p>
-      <w:r>
-        <w:t>__________________________________________________________________________________________</w:t>
-      </w:r>
-    </w:p>
-    <w:p>
+      <w:pPr>
+        <w:keepNext/>
+        <w:widowControl/>
+        <w:spacing w:line="240" w:lineRule="auto" w:after="0" w:before="120"/>
+      </w:pPr>
       <w:r>
         <w:rPr>
+          <w:rFonts w:ascii="Times New Roman" w:hAnsi="Times New Roman" w:eastAsia="Times New Roman"/>
           <w:b/>
-          <w:sz w:val="24"/>
+          <w:color w:val="181A1F"/>
+          <w:sz w:val="28"/>
         </w:rPr>
         <w:t>20.</w:t>
       </w:r>
     </w:p>
     <w:p>
+      <w:pPr>
+        <w:widowControl/>
+        <w:spacing w:line="240" w:lineRule="auto" w:after="0"/>
+      </w:pPr>
       <w:r>
         <w:rPr>
+          <w:rFonts w:ascii="Times New Roman" w:hAnsi="Times New Roman" w:eastAsia="Times New Roman"/>
           <w:b w:val="0"/>
           <w:i w:val="0"/>
+          <w:color w:val="181A1F"/>
+          <w:sz w:val="28"/>
         </w:rPr>
         <w:t>На графике изображено изменение ситуации на рынке бытовой техники в стране Z. Кривая предложения переместилась из положения S в положение S1 при неизменном спросе D. (На графике Р — цена товара; Q — количество товара)</w:t>
       </w:r>
     </w:p>
     <w:p>
       <w:pPr>
+        <w:widowControl/>
+        <w:spacing w:line="240" w:lineRule="auto" w:after="0"/>
         <w:jc w:val="center"/>
       </w:pPr>
       <w:r>
+        <w:rPr>
+          <w:rFonts w:ascii="Times New Roman" w:hAnsi="Times New Roman" w:eastAsia="Times New Roman"/>
+          <w:color w:val="181A1F"/>
+          <w:sz w:val="28"/>
+        </w:rPr>
         <w:drawing>
           <wp:inline xmlns:a="http://schemas.openxmlformats.org/drawingml/2006/main" xmlns:pic="http://schemas.openxmlformats.org/drawingml/2006/picture">
             <wp:extent cx="5400000" cy="5400000"/>
@@ -1857,1382 +3072,378 @@
       </w:r>
     </w:p>
     <w:p>
+      <w:pPr>
+        <w:widowControl/>
+        <w:spacing w:line="240" w:lineRule="auto" w:after="0"/>
+      </w:pPr>
       <w:r>
         <w:rPr>
+          <w:rFonts w:ascii="Times New Roman" w:hAnsi="Times New Roman" w:eastAsia="Times New Roman"/>
           <w:b w:val="0"/>
           <w:i w:val="0"/>
+          <w:color w:val="181A1F"/>
+          <w:sz w:val="28"/>
         </w:rPr>
         <w:t>Как изменилась равновесная цена?</w:t>
       </w:r>
     </w:p>
     <w:p>
+      <w:pPr>
+        <w:widowControl/>
+        <w:spacing w:line="240" w:lineRule="auto" w:after="0"/>
+      </w:pPr>
       <w:r>
         <w:rPr>
+          <w:rFonts w:ascii="Times New Roman" w:hAnsi="Times New Roman" w:eastAsia="Times New Roman"/>
           <w:b w:val="0"/>
           <w:i w:val="0"/>
+          <w:color w:val="181A1F"/>
+          <w:sz w:val="28"/>
         </w:rPr>
         <w:t>Что могло вызвать изменение предложения? Сначала укажите любое одно обстоятельство (фактор), затем объясните его влияние на предложение (обязательно укажите характер изменения предложения). (Объяснение должно быть дано применительно к рынку, указанному в тексте задания.)</w:t>
       </w:r>
     </w:p>
     <w:p>
+      <w:pPr>
+        <w:widowControl/>
+        <w:spacing w:line="240" w:lineRule="auto" w:after="0"/>
+      </w:pPr>
       <w:r>
         <w:rPr>
+          <w:rFonts w:ascii="Times New Roman" w:hAnsi="Times New Roman" w:eastAsia="Times New Roman"/>
           <w:b w:val="0"/>
           <w:i w:val="0"/>
+          <w:color w:val="181A1F"/>
+          <w:sz w:val="28"/>
         </w:rPr>
         <w:t>Как изменятся спрос и равновесная цена на данном рынке, если при прочих равных условиях уменьшатся доходы населения?</w:t>
       </w:r>
     </w:p>
     <w:p>
+      <w:pPr>
+        <w:widowControl/>
+        <w:spacing w:line="240" w:lineRule="auto" w:after="0"/>
+      </w:pPr>
       <w:r>
+        <w:rPr>
+          <w:rFonts w:ascii="Times New Roman" w:hAnsi="Times New Roman" w:eastAsia="Times New Roman"/>
+          <w:color w:val="181A1F"/>
+          <w:sz w:val="28"/>
+        </w:rPr>
         <w:t>Ответ:</w:t>
       </w:r>
     </w:p>
     <w:p>
-      <w:r>
-        <w:t>__________________________________________________________________________________________</w:t>
-      </w:r>
-    </w:p>
-    <w:p>
-      <w:r>
-        <w:t>__________________________________________________________________________________________</w:t>
-      </w:r>
-    </w:p>
-    <w:p>
-      <w:r>
-        <w:t>__________________________________________________________________________________________</w:t>
-      </w:r>
-    </w:p>
-    <w:p>
+      <w:pPr>
+        <w:keepNext/>
+        <w:widowControl/>
+        <w:spacing w:line="240" w:lineRule="auto" w:after="0" w:before="120"/>
+      </w:pPr>
       <w:r>
         <w:rPr>
+          <w:rFonts w:ascii="Times New Roman" w:hAnsi="Times New Roman" w:eastAsia="Times New Roman"/>
           <w:b/>
-          <w:sz w:val="24"/>
+          <w:color w:val="181A1F"/>
+          <w:sz w:val="28"/>
         </w:rPr>
         <w:t>21.</w:t>
       </w:r>
     </w:p>
     <w:p>
+      <w:pPr>
+        <w:widowControl/>
+        <w:spacing w:line="240" w:lineRule="auto" w:after="0"/>
+      </w:pPr>
       <w:r>
         <w:rPr>
+          <w:rFonts w:ascii="Times New Roman" w:hAnsi="Times New Roman" w:eastAsia="Times New Roman"/>
           <w:b w:val="0"/>
           <w:i w:val="0"/>
+          <w:color w:val="181A1F"/>
+          <w:sz w:val="28"/>
         </w:rPr>
         <w:t>Проиллюстрируйте меры государства: 1) по обеспечению занятости. 2) по развитию доступных для всех образования, медицины и т.д. 3) По созданию достойных бытовых условий. (Каждый пример должен быть сформулирован развёрнуто.)</w:t>
       </w:r>
     </w:p>
     <w:p>
+      <w:pPr>
+        <w:widowControl/>
+        <w:spacing w:line="240" w:lineRule="auto" w:after="0"/>
+      </w:pPr>
       <w:r>
+        <w:rPr>
+          <w:rFonts w:ascii="Times New Roman" w:hAnsi="Times New Roman" w:eastAsia="Times New Roman"/>
+          <w:color w:val="181A1F"/>
+          <w:sz w:val="28"/>
+        </w:rPr>
         <w:t>Ответ:</w:t>
       </w:r>
     </w:p>
     <w:p>
-      <w:r>
-        <w:t>__________________________________________________________________________________________</w:t>
-      </w:r>
-    </w:p>
-    <w:p>
-      <w:r>
-        <w:t>__________________________________________________________________________________________</w:t>
-      </w:r>
-    </w:p>
-    <w:p>
-      <w:r>
-        <w:t>__________________________________________________________________________________________</w:t>
-      </w:r>
-    </w:p>
-    <w:p>
+      <w:pPr>
+        <w:keepNext/>
+        <w:widowControl/>
+        <w:spacing w:line="240" w:lineRule="auto" w:after="0" w:before="120"/>
+      </w:pPr>
       <w:r>
         <w:rPr>
+          <w:rFonts w:ascii="Times New Roman" w:hAnsi="Times New Roman" w:eastAsia="Times New Roman"/>
           <w:b/>
-          <w:sz w:val="24"/>
+          <w:color w:val="181A1F"/>
+          <w:sz w:val="28"/>
         </w:rPr>
         <w:t>22.</w:t>
       </w:r>
     </w:p>
     <w:p>
+      <w:pPr>
+        <w:widowControl/>
+        <w:spacing w:line="240" w:lineRule="auto" w:after="0"/>
+      </w:pPr>
       <w:r>
         <w:rPr>
+          <w:rFonts w:ascii="Times New Roman" w:hAnsi="Times New Roman" w:eastAsia="Times New Roman"/>
           <w:b w:val="0"/>
           <w:i w:val="0"/>
+          <w:color w:val="181A1F"/>
+          <w:sz w:val="28"/>
         </w:rPr>
         <w:t xml:space="preserve">Гражданин Российской Федерации Павел Н. работает инженером слаботочных систем в компании «Московский метрополитен». За выполнение работы, предусмотренной трудовым договором, должностной инструкцией и типовым положением об оплате труда, он ежемесячно получает фиксированный размер денежных средств. Ежемесячно в бюджет происходит отчисление налога на доходы физических лиц (НДФЛ). Размер его составляет 13 % от заработной платы. Павел Н. решил взять кредит на покупку автомобиля. </w:t>
       </w:r>
     </w:p>
     <w:p>
+      <w:pPr>
+        <w:widowControl/>
+        <w:spacing w:line="240" w:lineRule="auto" w:after="0"/>
+      </w:pPr>
       <w:r>
         <w:rPr>
+          <w:rFonts w:ascii="Times New Roman" w:hAnsi="Times New Roman" w:eastAsia="Times New Roman"/>
           <w:b w:val="0"/>
           <w:i w:val="0"/>
+          <w:color w:val="181A1F"/>
+          <w:sz w:val="28"/>
         </w:rPr>
         <w:t>Какую форму (систему) денежной оплаты труда иллюстрирует приведённый пример? К какому виду налогов (в зависимости от того, на какой территории они обязательны к уплате) относится НДФЛ? Как называют элемент налогообложения, обозначенный в условии задачи как 13 %? О каких трёх принципах кредита должен прежде всего знать заёмщик?</w:t>
       </w:r>
     </w:p>
     <w:p>
+      <w:pPr>
+        <w:widowControl/>
+        <w:spacing w:line="240" w:lineRule="auto" w:after="0"/>
+      </w:pPr>
       <w:r>
+        <w:rPr>
+          <w:rFonts w:ascii="Times New Roman" w:hAnsi="Times New Roman" w:eastAsia="Times New Roman"/>
+          <w:color w:val="181A1F"/>
+          <w:sz w:val="28"/>
+        </w:rPr>
         <w:t>Ответ:</w:t>
       </w:r>
     </w:p>
     <w:p>
-      <w:r>
-        <w:t>__________________________________________________________________________________________</w:t>
-      </w:r>
-    </w:p>
-    <w:p>
-      <w:r>
-        <w:t>__________________________________________________________________________________________</w:t>
-      </w:r>
-    </w:p>
-    <w:p>
-      <w:r>
-        <w:t>__________________________________________________________________________________________</w:t>
-      </w:r>
-    </w:p>
-    <w:p>
+      <w:pPr>
+        <w:keepNext/>
+        <w:widowControl/>
+        <w:spacing w:line="240" w:lineRule="auto" w:after="0" w:before="120"/>
+      </w:pPr>
       <w:r>
         <w:rPr>
+          <w:rFonts w:ascii="Times New Roman" w:hAnsi="Times New Roman" w:eastAsia="Times New Roman"/>
           <w:b/>
-          <w:sz w:val="24"/>
+          <w:color w:val="181A1F"/>
+          <w:sz w:val="28"/>
         </w:rPr>
         <w:t>23.</w:t>
       </w:r>
     </w:p>
     <w:p>
+      <w:pPr>
+        <w:widowControl/>
+        <w:spacing w:line="240" w:lineRule="auto" w:after="0"/>
+      </w:pPr>
       <w:r>
         <w:rPr>
+          <w:rFonts w:ascii="Times New Roman" w:hAnsi="Times New Roman" w:eastAsia="Times New Roman"/>
           <w:b w:val="0"/>
           <w:i w:val="0"/>
+          <w:color w:val="181A1F"/>
+          <w:sz w:val="28"/>
         </w:rPr>
         <w:t>Назовите любые три потребности человека и на конкретных примерах покажите, как каждую из них человек удовлетворяет в процессе экономической деятельности. (В каждом случае сначала укажите потребность, затем приведите соответствующий пример. Каждый пример должен быть сформулирован развёрнуто.)</w:t>
       </w:r>
     </w:p>
     <w:p>
+      <w:pPr>
+        <w:widowControl/>
+        <w:spacing w:line="240" w:lineRule="auto" w:after="0"/>
+      </w:pPr>
       <w:r>
+        <w:rPr>
+          <w:rFonts w:ascii="Times New Roman" w:hAnsi="Times New Roman" w:eastAsia="Times New Roman"/>
+          <w:color w:val="181A1F"/>
+          <w:sz w:val="28"/>
+        </w:rPr>
         <w:t>Ответ:</w:t>
       </w:r>
     </w:p>
     <w:p>
-      <w:r>
-        <w:t>__________________________________________________________________________________________</w:t>
-      </w:r>
-    </w:p>
-    <w:p>
-      <w:r>
-        <w:t>__________________________________________________________________________________________</w:t>
-      </w:r>
-    </w:p>
-    <w:p>
-      <w:r>
-        <w:t>__________________________________________________________________________________________</w:t>
-      </w:r>
-    </w:p>
-    <w:p>
+      <w:pPr>
+        <w:keepNext/>
+        <w:widowControl/>
+        <w:spacing w:line="240" w:lineRule="auto" w:after="0" w:before="120"/>
+      </w:pPr>
       <w:r>
         <w:rPr>
+          <w:rFonts w:ascii="Times New Roman" w:hAnsi="Times New Roman" w:eastAsia="Times New Roman"/>
           <w:b/>
-          <w:sz w:val="24"/>
+          <w:color w:val="181A1F"/>
+          <w:sz w:val="28"/>
         </w:rPr>
         <w:t>24.</w:t>
       </w:r>
     </w:p>
     <w:p>
+      <w:pPr>
+        <w:widowControl/>
+        <w:spacing w:line="240" w:lineRule="auto" w:after="0"/>
+      </w:pPr>
       <w:r>
         <w:rPr>
+          <w:rFonts w:ascii="Times New Roman" w:hAnsi="Times New Roman" w:eastAsia="Times New Roman"/>
           <w:b w:val="0"/>
           <w:i w:val="0"/>
+          <w:color w:val="181A1F"/>
+          <w:sz w:val="28"/>
         </w:rPr>
         <w:t>Используя обществоведческие знания, составьте сложный план, позволяющий раскрыть по существу тему «Заработная плата работника в современной экономике». Сложный план должен содержать не менее трёх непосредственно раскрывающих тему по существу пунктов, детализированных в подпунктах. (Количество подпунктов каждого детализированного пункта должно быть не менее трёх, за исключением случаев, когда с точки зрения общественных наук возможны только два подпункта.)</w:t>
       </w:r>
     </w:p>
     <w:p>
+      <w:pPr>
+        <w:widowControl/>
+        <w:spacing w:line="240" w:lineRule="auto" w:after="0"/>
+      </w:pPr>
       <w:r>
+        <w:rPr>
+          <w:rFonts w:ascii="Times New Roman" w:hAnsi="Times New Roman" w:eastAsia="Times New Roman"/>
+          <w:color w:val="181A1F"/>
+          <w:sz w:val="28"/>
+        </w:rPr>
         <w:t>Ответ:</w:t>
       </w:r>
     </w:p>
     <w:p>
-      <w:r>
-        <w:t>__________________________________________________________________________________________</w:t>
-      </w:r>
-    </w:p>
-    <w:p>
-      <w:r>
-        <w:t>__________________________________________________________________________________________</w:t>
-      </w:r>
-    </w:p>
-    <w:p>
-      <w:r>
-        <w:t>__________________________________________________________________________________________</w:t>
-      </w:r>
-    </w:p>
-    <w:p>
-      <w:r>
-        <w:t>__________________________________________________________________________________________</w:t>
-      </w:r>
-    </w:p>
-    <w:p>
-      <w:r>
-        <w:t>__________________________________________________________________________________________</w:t>
-      </w:r>
-    </w:p>
-    <w:p>
+      <w:pPr>
+        <w:keepNext/>
+        <w:widowControl/>
+        <w:spacing w:line="240" w:lineRule="auto" w:after="0" w:before="120"/>
+      </w:pPr>
       <w:r>
         <w:rPr>
+          <w:rFonts w:ascii="Times New Roman" w:hAnsi="Times New Roman" w:eastAsia="Times New Roman"/>
           <w:b/>
-          <w:sz w:val="24"/>
+          <w:color w:val="181A1F"/>
+          <w:sz w:val="28"/>
         </w:rPr>
         <w:t>25.</w:t>
       </w:r>
     </w:p>
     <w:p>
+      <w:pPr>
+        <w:widowControl/>
+        <w:spacing w:line="240" w:lineRule="auto" w:after="0"/>
+      </w:pPr>
       <w:r>
         <w:rPr>
+          <w:rFonts w:ascii="Times New Roman" w:hAnsi="Times New Roman" w:eastAsia="Times New Roman"/>
           <w:b w:val="0"/>
           <w:i w:val="0"/>
+          <w:color w:val="181A1F"/>
+          <w:sz w:val="28"/>
         </w:rPr>
         <w:t>Обоснуйте значение фирм в обеспечении экономического развития государства. (Обоснование должно быть дано с опорой на обществоведческие знания в нескольких связанных между собой распространённых предложениях, раскрывать причинно-следственные и (или) функциональные связи.)</w:t>
       </w:r>
     </w:p>
     <w:p>
+      <w:pPr>
+        <w:widowControl/>
+        <w:spacing w:line="240" w:lineRule="auto" w:after="0"/>
+      </w:pPr>
       <w:r>
         <w:rPr>
+          <w:rFonts w:ascii="Times New Roman" w:hAnsi="Times New Roman" w:eastAsia="Times New Roman"/>
           <w:b w:val="0"/>
           <w:i w:val="0"/>
+          <w:color w:val="181A1F"/>
+          <w:sz w:val="28"/>
         </w:rPr>
         <w:t>Какие конкурентные преимущества позволяют фирмам быть успешными на рынке? (Назовите любые три подобных преимущества.)</w:t>
       </w:r>
     </w:p>
     <w:p>
+      <w:pPr>
+        <w:widowControl/>
+        <w:spacing w:line="240" w:lineRule="auto" w:after="0"/>
+      </w:pPr>
       <w:r>
         <w:rPr>
+          <w:rFonts w:ascii="Times New Roman" w:hAnsi="Times New Roman" w:eastAsia="Times New Roman"/>
           <w:b w:val="0"/>
           <w:i w:val="0"/>
+          <w:color w:val="181A1F"/>
+          <w:sz w:val="28"/>
         </w:rPr>
         <w:t>Для каждого из указанных в пункте 2 конкурентных преимуществ приведите по одному примеру, иллюстрирующему его применение на рынке. (Каждый пример должен быть сформулирован развёрнуто.)</w:t>
       </w:r>
     </w:p>
     <w:p>
+      <w:pPr>
+        <w:widowControl/>
+        <w:spacing w:line="240" w:lineRule="auto" w:after="0"/>
+      </w:pPr>
       <w:r>
+        <w:rPr>
+          <w:rFonts w:ascii="Times New Roman" w:hAnsi="Times New Roman" w:eastAsia="Times New Roman"/>
+          <w:color w:val="181A1F"/>
+          <w:sz w:val="28"/>
+        </w:rPr>
         <w:t>Ответ:</w:t>
       </w:r>
     </w:p>
     <w:p>
+      <w:pPr>
+        <w:widowControl/>
+        <w:spacing w:line="240" w:lineRule="auto" w:after="0"/>
+      </w:pPr>
       <w:r>
-        <w:t>__________________________________________________________________________________________</w:t>
-      </w:r>
-    </w:p>
-    <w:p>
-      <w:r>
-        <w:t>__________________________________________________________________________________________</w:t>
-      </w:r>
-    </w:p>
-    <w:p>
-      <w:r>
-        <w:t>__________________________________________________________________________________________</w:t>
-      </w:r>
-    </w:p>
-    <w:p>
-      <w:r>
-        <w:t>__________________________________________________________________________________________</w:t>
-      </w:r>
-    </w:p>
-    <w:p>
-      <w:r>
-        <w:t>__________________________________________________________________________________________</w:t>
-      </w:r>
-    </w:p>
-    <w:p>
-      <w:r>
+        <w:rPr>
+          <w:rFonts w:ascii="Times New Roman" w:hAnsi="Times New Roman" w:eastAsia="Times New Roman"/>
+          <w:color w:val="181A1F"/>
+          <w:sz w:val="28"/>
+        </w:rPr>
         <w:br w:type="page"/>
       </w:r>
     </w:p>
-    <w:p>
-      <w:pPr>
-        <w:pStyle w:val="Heading1"/>
-      </w:pPr>
-      <w:r>
-        <w:t>Ответы и критерии</w:t>
-      </w:r>
-    </w:p>
-    <w:tbl>
-      <w:tblPr>
-        <w:tblStyle w:val="TableGrid"/>
-        <w:tblW w:type="auto" w:w="0"/>
-        <w:tblLook w:firstColumn="1" w:firstRow="1" w:lastColumn="0" w:lastRow="0" w:noHBand="0" w:noVBand="1" w:val="04A0"/>
-      </w:tblPr>
-      <w:tblGrid>
-        <w:gridCol w:w="3419"/>
-        <w:gridCol w:w="3419"/>
-        <w:gridCol w:w="3419"/>
-      </w:tblGrid>
-      <w:tr>
-        <w:tc>
-          <w:tcPr>
-            <w:tcW w:type="dxa" w:w="3419"/>
-            <w:shd w:fill="DCE9FA"/>
-          </w:tcPr>
-          <w:p>
-            <w:r>
-              <w:t>№</w:t>
-            </w:r>
-          </w:p>
-        </w:tc>
-        <w:tc>
-          <w:tcPr>
-            <w:tcW w:type="dxa" w:w="3419"/>
-            <w:shd w:fill="DCE9FA"/>
-          </w:tcPr>
-          <w:p>
-            <w:r>
-              <w:t>Ответ</w:t>
-            </w:r>
-          </w:p>
-        </w:tc>
-        <w:tc>
-          <w:tcPr>
-            <w:tcW w:type="dxa" w:w="3419"/>
-            <w:shd w:fill="DCE9FA"/>
-          </w:tcPr>
-          <w:p>
-            <w:r>
-              <w:t>Макс. балл</w:t>
-            </w:r>
-          </w:p>
-        </w:tc>
-      </w:tr>
-      <w:tr>
-        <w:tc>
-          <w:tcPr>
-            <w:tcW w:type="dxa" w:w="3419"/>
-          </w:tcPr>
-          <w:p>
-            <w:r>
-              <w:t>1</w:t>
-            </w:r>
-          </w:p>
-        </w:tc>
-        <w:tc>
-          <w:tcPr>
-            <w:tcW w:type="dxa" w:w="3419"/>
-          </w:tcPr>
-          <w:p>
-            <w:r>
-              <w:t>34</w:t>
-            </w:r>
-          </w:p>
-        </w:tc>
-        <w:tc>
-          <w:tcPr>
-            <w:tcW w:type="dxa" w:w="3419"/>
-          </w:tcPr>
-          <w:p>
-            <w:r>
-              <w:t>1</w:t>
-            </w:r>
-          </w:p>
-        </w:tc>
-      </w:tr>
-      <w:tr>
-        <w:tc>
-          <w:tcPr>
-            <w:tcW w:type="dxa" w:w="3419"/>
-          </w:tcPr>
-          <w:p>
-            <w:r>
-              <w:t>2</w:t>
-            </w:r>
-          </w:p>
-        </w:tc>
-        <w:tc>
-          <w:tcPr>
-            <w:tcW w:type="dxa" w:w="3419"/>
-          </w:tcPr>
-          <w:p>
-            <w:r>
-              <w:t>146</w:t>
-            </w:r>
-          </w:p>
-        </w:tc>
-        <w:tc>
-          <w:tcPr>
-            <w:tcW w:type="dxa" w:w="3419"/>
-          </w:tcPr>
-          <w:p>
-            <w:r>
-              <w:t>2</w:t>
-            </w:r>
-          </w:p>
-        </w:tc>
-      </w:tr>
-      <w:tr>
-        <w:tc>
-          <w:tcPr>
-            <w:tcW w:type="dxa" w:w="3419"/>
-          </w:tcPr>
-          <w:p>
-            <w:r>
-              <w:t>3</w:t>
-            </w:r>
-          </w:p>
-        </w:tc>
-        <w:tc>
-          <w:tcPr>
-            <w:tcW w:type="dxa" w:w="3419"/>
-          </w:tcPr>
-          <w:p>
-            <w:r>
-              <w:t>16</w:t>
-            </w:r>
-          </w:p>
-        </w:tc>
-        <w:tc>
-          <w:tcPr>
-            <w:tcW w:type="dxa" w:w="3419"/>
-          </w:tcPr>
-          <w:p>
-            <w:r>
-              <w:t>1</w:t>
-            </w:r>
-          </w:p>
-        </w:tc>
-      </w:tr>
-      <w:tr>
-        <w:tc>
-          <w:tcPr>
-            <w:tcW w:type="dxa" w:w="3419"/>
-          </w:tcPr>
-          <w:p>
-            <w:r>
-              <w:t>4</w:t>
-            </w:r>
-          </w:p>
-        </w:tc>
-        <w:tc>
-          <w:tcPr>
-            <w:tcW w:type="dxa" w:w="3419"/>
-          </w:tcPr>
-          <w:p>
-            <w:r>
-              <w:t>56</w:t>
-            </w:r>
-          </w:p>
-        </w:tc>
-        <w:tc>
-          <w:tcPr>
-            <w:tcW w:type="dxa" w:w="3419"/>
-          </w:tcPr>
-          <w:p>
-            <w:r>
-              <w:t>2</w:t>
-            </w:r>
-          </w:p>
-        </w:tc>
-      </w:tr>
-      <w:tr>
-        <w:tc>
-          <w:tcPr>
-            <w:tcW w:type="dxa" w:w="3419"/>
-          </w:tcPr>
-          <w:p>
-            <w:r>
-              <w:t>5</w:t>
-            </w:r>
-          </w:p>
-        </w:tc>
-        <w:tc>
-          <w:tcPr>
-            <w:tcW w:type="dxa" w:w="3419"/>
-          </w:tcPr>
-          <w:p>
-            <w:r>
-              <w:t>236</w:t>
-            </w:r>
-          </w:p>
-        </w:tc>
-        <w:tc>
-          <w:tcPr>
-            <w:tcW w:type="dxa" w:w="3419"/>
-          </w:tcPr>
-          <w:p>
-            <w:r>
-              <w:t>2</w:t>
-            </w:r>
-          </w:p>
-        </w:tc>
-      </w:tr>
-      <w:tr>
-        <w:tc>
-          <w:tcPr>
-            <w:tcW w:type="dxa" w:w="3419"/>
-          </w:tcPr>
-          <w:p>
-            <w:r>
-              <w:t>6</w:t>
-            </w:r>
-          </w:p>
-        </w:tc>
-        <w:tc>
-          <w:tcPr>
-            <w:tcW w:type="dxa" w:w="3419"/>
-          </w:tcPr>
-          <w:p>
-            <w:r>
-              <w:t>145</w:t>
-            </w:r>
-          </w:p>
-        </w:tc>
-        <w:tc>
-          <w:tcPr>
-            <w:tcW w:type="dxa" w:w="3419"/>
-          </w:tcPr>
-          <w:p>
-            <w:r>
-              <w:t>2</w:t>
-            </w:r>
-          </w:p>
-        </w:tc>
-      </w:tr>
-      <w:tr>
-        <w:tc>
-          <w:tcPr>
-            <w:tcW w:type="dxa" w:w="3419"/>
-          </w:tcPr>
-          <w:p>
-            <w:r>
-              <w:t>7</w:t>
-            </w:r>
-          </w:p>
-        </w:tc>
-        <w:tc>
-          <w:tcPr>
-            <w:tcW w:type="dxa" w:w="3419"/>
-          </w:tcPr>
-          <w:p>
-            <w:r>
-              <w:t>145</w:t>
-            </w:r>
-          </w:p>
-        </w:tc>
-        <w:tc>
-          <w:tcPr>
-            <w:tcW w:type="dxa" w:w="3419"/>
-          </w:tcPr>
-          <w:p>
-            <w:r>
-              <w:t>2</w:t>
-            </w:r>
-          </w:p>
-        </w:tc>
-      </w:tr>
-      <w:tr>
-        <w:tc>
-          <w:tcPr>
-            <w:tcW w:type="dxa" w:w="3419"/>
-          </w:tcPr>
-          <w:p>
-            <w:r>
-              <w:t>8</w:t>
-            </w:r>
-          </w:p>
-        </w:tc>
-        <w:tc>
-          <w:tcPr>
-            <w:tcW w:type="dxa" w:w="3419"/>
-          </w:tcPr>
-          <w:p>
-            <w:r>
-              <w:t>245</w:t>
-            </w:r>
-          </w:p>
-        </w:tc>
-        <w:tc>
-          <w:tcPr>
-            <w:tcW w:type="dxa" w:w="3419"/>
-          </w:tcPr>
-          <w:p>
-            <w:r>
-              <w:t>2</w:t>
-            </w:r>
-          </w:p>
-        </w:tc>
-      </w:tr>
-      <w:tr>
-        <w:tc>
-          <w:tcPr>
-            <w:tcW w:type="dxa" w:w="3419"/>
-          </w:tcPr>
-          <w:p>
-            <w:r>
-              <w:t>9</w:t>
-            </w:r>
-          </w:p>
-        </w:tc>
-        <w:tc>
-          <w:tcPr>
-            <w:tcW w:type="dxa" w:w="3419"/>
-          </w:tcPr>
-          <w:p>
-            <w:r>
-              <w:t>56</w:t>
-            </w:r>
-          </w:p>
-        </w:tc>
-        <w:tc>
-          <w:tcPr>
-            <w:tcW w:type="dxa" w:w="3419"/>
-          </w:tcPr>
-          <w:p>
-            <w:r>
-              <w:t>1</w:t>
-            </w:r>
-          </w:p>
-        </w:tc>
-      </w:tr>
-      <w:tr>
-        <w:tc>
-          <w:tcPr>
-            <w:tcW w:type="dxa" w:w="3419"/>
-          </w:tcPr>
-          <w:p>
-            <w:r>
-              <w:t>10</w:t>
-            </w:r>
-          </w:p>
-        </w:tc>
-        <w:tc>
-          <w:tcPr>
-            <w:tcW w:type="dxa" w:w="3419"/>
-          </w:tcPr>
-          <w:p>
-            <w:r>
-              <w:t>135</w:t>
-            </w:r>
-          </w:p>
-        </w:tc>
-        <w:tc>
-          <w:tcPr>
-            <w:tcW w:type="dxa" w:w="3419"/>
-          </w:tcPr>
-          <w:p>
-            <w:r>
-              <w:t>2</w:t>
-            </w:r>
-          </w:p>
-        </w:tc>
-      </w:tr>
-      <w:tr>
-        <w:tc>
-          <w:tcPr>
-            <w:tcW w:type="dxa" w:w="3419"/>
-          </w:tcPr>
-          <w:p>
-            <w:r>
-              <w:t>11</w:t>
-            </w:r>
-          </w:p>
-        </w:tc>
-        <w:tc>
-          <w:tcPr>
-            <w:tcW w:type="dxa" w:w="3419"/>
-          </w:tcPr>
-          <w:p>
-            <w:r>
-              <w:t>124</w:t>
-            </w:r>
-          </w:p>
-        </w:tc>
-        <w:tc>
-          <w:tcPr>
-            <w:tcW w:type="dxa" w:w="3419"/>
-          </w:tcPr>
-          <w:p>
-            <w:r>
-              <w:t>2</w:t>
-            </w:r>
-          </w:p>
-        </w:tc>
-      </w:tr>
-      <w:tr>
-        <w:tc>
-          <w:tcPr>
-            <w:tcW w:type="dxa" w:w="3419"/>
-          </w:tcPr>
-          <w:p>
-            <w:r>
-              <w:t>12</w:t>
-            </w:r>
-          </w:p>
-        </w:tc>
-        <w:tc>
-          <w:tcPr>
-            <w:tcW w:type="dxa" w:w="3419"/>
-          </w:tcPr>
-          <w:p>
-            <w:r>
-              <w:t>56</w:t>
-            </w:r>
-          </w:p>
-        </w:tc>
-        <w:tc>
-          <w:tcPr>
-            <w:tcW w:type="dxa" w:w="3419"/>
-          </w:tcPr>
-          <w:p>
-            <w:r>
-              <w:t>1</w:t>
-            </w:r>
-          </w:p>
-        </w:tc>
-      </w:tr>
-      <w:tr>
-        <w:tc>
-          <w:tcPr>
-            <w:tcW w:type="dxa" w:w="3419"/>
-          </w:tcPr>
-          <w:p>
-            <w:r>
-              <w:t>13</w:t>
-            </w:r>
-          </w:p>
-        </w:tc>
-        <w:tc>
-          <w:tcPr>
-            <w:tcW w:type="dxa" w:w="3419"/>
-          </w:tcPr>
-          <w:p>
-            <w:r>
-              <w:t>35</w:t>
-            </w:r>
-          </w:p>
-        </w:tc>
-        <w:tc>
-          <w:tcPr>
-            <w:tcW w:type="dxa" w:w="3419"/>
-          </w:tcPr>
-          <w:p>
-            <w:r>
-              <w:t>2</w:t>
-            </w:r>
-          </w:p>
-        </w:tc>
-      </w:tr>
-      <w:tr>
-        <w:tc>
-          <w:tcPr>
-            <w:tcW w:type="dxa" w:w="3419"/>
-          </w:tcPr>
-          <w:p>
-            <w:r>
-              <w:t>14</w:t>
-            </w:r>
-          </w:p>
-        </w:tc>
-        <w:tc>
-          <w:tcPr>
-            <w:tcW w:type="dxa" w:w="3419"/>
-          </w:tcPr>
-          <w:p>
-            <w:r>
-              <w:t>13424</w:t>
-            </w:r>
-          </w:p>
-        </w:tc>
-        <w:tc>
-          <w:tcPr>
-            <w:tcW w:type="dxa" w:w="3419"/>
-          </w:tcPr>
-          <w:p>
-            <w:r>
-              <w:t>2</w:t>
-            </w:r>
-          </w:p>
-        </w:tc>
-      </w:tr>
-      <w:tr>
-        <w:tc>
-          <w:tcPr>
-            <w:tcW w:type="dxa" w:w="3419"/>
-          </w:tcPr>
-          <w:p>
-            <w:r>
-              <w:t>15</w:t>
-            </w:r>
-          </w:p>
-        </w:tc>
-        <w:tc>
-          <w:tcPr>
-            <w:tcW w:type="dxa" w:w="3419"/>
-          </w:tcPr>
-          <w:p>
-            <w:r>
-              <w:t>234</w:t>
-            </w:r>
-          </w:p>
-        </w:tc>
-        <w:tc>
-          <w:tcPr>
-            <w:tcW w:type="dxa" w:w="3419"/>
-          </w:tcPr>
-          <w:p>
-            <w:r>
-              <w:t>2</w:t>
-            </w:r>
-          </w:p>
-        </w:tc>
-      </w:tr>
-      <w:tr>
-        <w:tc>
-          <w:tcPr>
-            <w:tcW w:type="dxa" w:w="3419"/>
-          </w:tcPr>
-          <w:p>
-            <w:r>
-              <w:t>16</w:t>
-            </w:r>
-          </w:p>
-        </w:tc>
-        <w:tc>
-          <w:tcPr>
-            <w:tcW w:type="dxa" w:w="3419"/>
-          </w:tcPr>
-          <w:p>
-            <w:r>
-              <w:t>12212</w:t>
-            </w:r>
-          </w:p>
-        </w:tc>
-        <w:tc>
-          <w:tcPr>
-            <w:tcW w:type="dxa" w:w="3419"/>
-          </w:tcPr>
-          <w:p>
-            <w:r>
-              <w:t>2</w:t>
-            </w:r>
-          </w:p>
-        </w:tc>
-      </w:tr>
-    </w:tbl>
-    <w:p>
-      <w:r>
-        <w:rPr>
-          <w:b/>
-        </w:rPr>
-        <w:t>Задание 17 — до 2 баллов</w:t>
-      </w:r>
-    </w:p>
-    <w:p>
-      <w:r>
-        <w:rPr>
-          <w:b w:val="0"/>
-          <w:i w:val="0"/>
-        </w:rPr>
-        <w:t>1. Ключевым фактором развития автор считает благополучие людей, достаток в российских семьях;</w:t>
-      </w:r>
-    </w:p>
-    <w:p>
-      <w:r>
-        <w:rPr>
-          <w:b w:val="0"/>
-          <w:i w:val="0"/>
-        </w:rPr>
-        <w:t>2. серьёзно обновить структуру занятости, дать людям хорошую работу, создать современные, достойно оплачиваемые рабочие места.</w:t>
-      </w:r>
-    </w:p>
-    <w:p>
-      <w:r>
-        <w:rPr>
-          <w:b w:val="0"/>
-          <w:i w:val="0"/>
-        </w:rPr>
-        <w:t>3.  Программа материнского капитала, льготная ипотеки на улучшение жилищных условий для семей с детьми.</w:t>
-      </w:r>
-    </w:p>
-    <w:p>
-      <w:r>
-        <w:rPr>
-          <w:b/>
-        </w:rPr>
-        <w:t>Задание 18 — до 2 баллов</w:t>
-      </w:r>
-    </w:p>
-    <w:p>
-      <w:r>
-        <w:rPr>
-          <w:b w:val="0"/>
-          <w:i w:val="0"/>
-        </w:rPr>
-        <w:t>1) На взаимодействиях индивидов с преобразованной ими природой, в частности с техникой, искусственно созданными ландшафтами, зданиями и сооружениями.</w:t>
-      </w:r>
-    </w:p>
-    <w:p>
-      <w:r>
-        <w:rPr>
-          <w:b w:val="0"/>
-          <w:i w:val="0"/>
-        </w:rPr>
-        <w:t>2) В доиндустриальном обществе основным типом производственной деятельности является добыча и изготовление продуктов, в индустриальном — последовательная обработка сырья и продуктов для получения окончательного продукта.</w:t>
-      </w:r>
-    </w:p>
-    <w:p>
-      <w:r>
-        <w:rPr>
-          <w:b w:val="0"/>
-          <w:i w:val="0"/>
-        </w:rPr>
-        <w:t>3) Каждый последующий этап развития экономики не отменяет, включает предыдущие.</w:t>
-      </w:r>
-    </w:p>
-    <w:p>
-      <w:r>
-        <w:rPr>
-          <w:b/>
-        </w:rPr>
-        <w:t>Задание 19 — до 3 баллов</w:t>
-      </w:r>
-    </w:p>
-    <w:p>
-      <w:r>
-        <w:rPr>
-          <w:b w:val="0"/>
-          <w:i w:val="0"/>
-        </w:rPr>
-        <w:t>1) Ценные бумаги (Покупка ценных бумаг позволяет сохранять деньги от инфляции и может даже принести прибыль, но риск ценных бумаг заключается в возможности падения их стоимости и банкротства компании-эмитента);</w:t>
-      </w:r>
-    </w:p>
-    <w:p>
-      <w:r>
-        <w:rPr>
-          <w:b w:val="0"/>
-          <w:i w:val="0"/>
-        </w:rPr>
-        <w:t>2) Валюта (Еще одним способом инвестирования является покупка стабильной иностранной валюты, так как годовая потеря ее покупательной способности намного ниже, чем у других валют, но риск заключается в том, что даже сильнейшие экономики мира могут попасть под удар кризиса, что приведет к обесцениванию валюты);</w:t>
-      </w:r>
-    </w:p>
-    <w:p>
-      <w:r>
-        <w:rPr>
-          <w:b w:val="0"/>
-          <w:i w:val="0"/>
-        </w:rPr>
-        <w:t>3) Вклад (Другим способом инвестирования является вклад в банке, с помощью него люди могут почти без риска получать доход в виде процента, но риск заключается в высокой инфляции, из-за чего средства на вкладе могут значительно потерять в покупательной способности, а также остается риск банкротства банка).</w:t>
-      </w:r>
-    </w:p>
-    <w:p>
-      <w:r>
-        <w:rPr>
-          <w:b/>
-        </w:rPr>
-        <w:t>Задание 20 — до 3 баллов</w:t>
-      </w:r>
-    </w:p>
-    <w:p>
-      <w:r>
-        <w:rPr>
-          <w:b w:val="0"/>
-          <w:i w:val="0"/>
-        </w:rPr>
-        <w:t>1) Равновесная цена увеличилась;</w:t>
-      </w:r>
-    </w:p>
-    <w:p>
-      <w:r>
-        <w:rPr>
-          <w:b w:val="0"/>
-          <w:i w:val="0"/>
-        </w:rPr>
-        <w:t>2) Налоги (В стране Z увеличились налоги на производителей бытовой техники, что привело к росту издержек производителей и снижению предложения бытовой техники);</w:t>
-      </w:r>
-    </w:p>
-    <w:p>
-      <w:r>
-        <w:rPr>
-          <w:b w:val="0"/>
-          <w:i w:val="0"/>
-        </w:rPr>
-        <w:t>3) Спрос уменьшится, равновесная цена уменьшится.</w:t>
-      </w:r>
-    </w:p>
-    <w:p>
-      <w:r>
-        <w:rPr>
-          <w:b/>
-        </w:rPr>
-        <w:t>Задание 21 — до 3 баллов</w:t>
-      </w:r>
-    </w:p>
-    <w:p>
-      <w:r>
-        <w:rPr>
-          <w:b w:val="0"/>
-          <w:i w:val="0"/>
-        </w:rPr>
-        <w:t>1) По обеспечению занятости (в стране Z работают центры занятости. Они помогают людям, не имеющим работу, найти подходящее им место, а в некоторых случаях предлагают пройти курсы по переквалификации)</w:t>
-      </w:r>
-    </w:p>
-    <w:p>
-      <w:r>
-        <w:rPr>
-          <w:b w:val="0"/>
-          <w:i w:val="0"/>
-        </w:rPr>
-        <w:t>2) По развитию доступных для всех образования, медицины и т.д. (в стране А была создана Национальная программа «Социальное государство». Это программа предполагает увеличение трат бюджета на социальные нужды, в том числе для обеспечения население качественной, бесплатной медициной и учебой в высших учебных заведениях, что сделает медицину и образование более доступными)</w:t>
-      </w:r>
-    </w:p>
-    <w:p>
-      <w:r>
-        <w:rPr>
-          <w:b w:val="0"/>
-          <w:i w:val="0"/>
-        </w:rPr>
-        <w:t>3) По созданию достойных бытовых условий (государство П ввело льготы на приобретения жилья для многодетных семей. Это сделано с целью улучшения качества жизни населения, обеспечения достойного уровня жизни и улучшению бытовых условий для нуждающихся семей)</w:t>
-      </w:r>
-    </w:p>
-    <w:p>
-      <w:r>
-        <w:rPr>
-          <w:b/>
-        </w:rPr>
-        <w:t>Задание 22 — до 4 баллов</w:t>
-      </w:r>
-    </w:p>
-    <w:p>
-      <w:r>
-        <w:rPr>
-          <w:b w:val="0"/>
-          <w:i w:val="0"/>
-        </w:rPr>
-        <w:t>1) Повременная (оклад).</w:t>
-      </w:r>
-    </w:p>
-    <w:p>
-      <w:r>
-        <w:rPr>
-          <w:b w:val="0"/>
-          <w:i w:val="0"/>
-        </w:rPr>
-        <w:t>2) НДФЛ относится к федеральным налогам.</w:t>
-      </w:r>
-    </w:p>
-    <w:p>
-      <w:r>
-        <w:rPr>
-          <w:b w:val="0"/>
-          <w:i w:val="0"/>
-        </w:rPr>
-        <w:t>3) 13 % — это налоговая ставка.</w:t>
-      </w:r>
-    </w:p>
-    <w:p>
-      <w:r>
-        <w:rPr>
-          <w:b w:val="0"/>
-          <w:i w:val="0"/>
-        </w:rPr>
-        <w:t>4) Возвратность, срочность, платность.</w:t>
-      </w:r>
-    </w:p>
-    <w:p>
-      <w:r>
-        <w:rPr>
-          <w:b/>
-        </w:rPr>
-        <w:t>Задание 23 — до 3 баллов</w:t>
-      </w:r>
-    </w:p>
-    <w:p>
-      <w:r>
-        <w:rPr>
-          <w:b w:val="0"/>
-          <w:i w:val="0"/>
-        </w:rPr>
-        <w:t>1) Потребность в труде (Максим работает на производстве мягких игрушек в городе S. Он работает для того, чтобы реализовывать себя и свои способности, а также для того, чтобы быть полноценным членом общества)</w:t>
-      </w:r>
-    </w:p>
-    <w:p>
-      <w:r>
-        <w:rPr>
-          <w:b w:val="0"/>
-          <w:i w:val="0"/>
-        </w:rPr>
-        <w:t>2) Потребность в самоактуализации (Георгий мечтает стать выдающимся учёным в сфере ядерной энергетики, для этого он пошёл работать в "Росатом". Спустя годы работы Георгий стал ведущим специалистом, он выступает на международный конференциях, а его научные работы задают стандарты для всей ядерной энергетики мира)</w:t>
-      </w:r>
-    </w:p>
-    <w:p>
-      <w:r>
-        <w:rPr>
-          <w:b w:val="0"/>
-          <w:i w:val="0"/>
-        </w:rPr>
-        <w:t>3) Потребность в одежде (Артём пошёл в торговый центр, где купил продукты на неделю и зимнюю одежду)</w:t>
-      </w:r>
-    </w:p>
-    <w:p>
-      <w:r>
-        <w:rPr>
-          <w:b/>
-        </w:rPr>
-        <w:t>Задание 24 — до 4 баллов</w:t>
-      </w:r>
-    </w:p>
-    <w:p>
-      <w:r>
-        <w:rPr>
-          <w:b w:val="0"/>
-          <w:i w:val="0"/>
-        </w:rPr>
-        <w:t>Заработная плата работника в современной экономике</w:t>
-      </w:r>
-    </w:p>
-    <w:p>
-      <w:r>
-        <w:rPr>
-          <w:b w:val="0"/>
-          <w:i w:val="0"/>
-        </w:rPr>
-        <w:t>1) Черты заработной платы:</w:t>
-      </w:r>
-    </w:p>
-    <w:p>
-      <w:r>
-        <w:rPr>
-          <w:b w:val="0"/>
-          <w:i w:val="0"/>
-        </w:rPr>
-        <w:t>а) выплачивается за трудовую деятельность;</w:t>
-      </w:r>
-    </w:p>
-    <w:p>
-      <w:r>
-        <w:rPr>
-          <w:b w:val="0"/>
-          <w:i w:val="0"/>
-        </w:rPr>
-        <w:t>б) выплачивается наемным работникам;</w:t>
-      </w:r>
-    </w:p>
-    <w:p>
-      <w:r>
-        <w:rPr>
-          <w:b w:val="0"/>
-          <w:i w:val="0"/>
-        </w:rPr>
-        <w:t>в) зависит от профессиональных качеств работника.</w:t>
-      </w:r>
-    </w:p>
-    <w:p>
-      <w:r>
-        <w:rPr>
-          <w:b w:val="0"/>
-          <w:i w:val="0"/>
-        </w:rPr>
-        <w:t>2) Виды заработной платы:</w:t>
-      </w:r>
-    </w:p>
-    <w:p>
-      <w:r>
-        <w:rPr>
-          <w:b w:val="0"/>
-          <w:i w:val="0"/>
-        </w:rPr>
-        <w:t>а) номинальная;</w:t>
-      </w:r>
-    </w:p>
-    <w:p>
-      <w:r>
-        <w:rPr>
-          <w:b w:val="0"/>
-          <w:i w:val="0"/>
-        </w:rPr>
-        <w:t>б) реальная.</w:t>
-      </w:r>
-    </w:p>
-    <w:p>
-      <w:r>
-        <w:rPr>
-          <w:b w:val="0"/>
-          <w:i w:val="0"/>
-        </w:rPr>
-        <w:t>3) Формы заработной платы в РФ:</w:t>
-      </w:r>
-    </w:p>
-    <w:p>
-      <w:r>
-        <w:rPr>
-          <w:b w:val="0"/>
-          <w:i w:val="0"/>
-        </w:rPr>
-        <w:t>а) сдельная;</w:t>
-      </w:r>
-    </w:p>
-    <w:p>
-      <w:r>
-        <w:rPr>
-          <w:b w:val="0"/>
-          <w:i w:val="0"/>
-        </w:rPr>
-        <w:t>б) повременная;</w:t>
-      </w:r>
-    </w:p>
-    <w:p>
-      <w:r>
-        <w:rPr>
-          <w:b w:val="0"/>
-          <w:i w:val="0"/>
-        </w:rPr>
-        <w:t>в) смешанная.</w:t>
-      </w:r>
-    </w:p>
-    <w:p>
-      <w:r>
-        <w:rPr>
-          <w:b w:val="0"/>
-          <w:i w:val="0"/>
-        </w:rPr>
-        <w:t>4) Функции заработной платы:</w:t>
-      </w:r>
-    </w:p>
-    <w:p>
-      <w:r>
-        <w:rPr>
-          <w:b w:val="0"/>
-          <w:i w:val="0"/>
-        </w:rPr>
-        <w:t>а) статусная;</w:t>
-      </w:r>
-    </w:p>
-    <w:p>
-      <w:r>
-        <w:rPr>
-          <w:b w:val="0"/>
-          <w:i w:val="0"/>
-        </w:rPr>
-        <w:t>б) мотивационная;</w:t>
-      </w:r>
-    </w:p>
-    <w:p>
-      <w:r>
-        <w:rPr>
-          <w:b w:val="0"/>
-          <w:i w:val="0"/>
-        </w:rPr>
-        <w:t>в) регулирующая.</w:t>
-      </w:r>
-    </w:p>
-    <w:p>
-      <w:r>
-        <w:rPr>
-          <w:b w:val="0"/>
-          <w:i w:val="0"/>
-        </w:rPr>
-        <w:t>5) Факторы, влияющие на заработную плату:</w:t>
-      </w:r>
-    </w:p>
-    <w:p>
-      <w:r>
-        <w:rPr>
-          <w:b w:val="0"/>
-          <w:i w:val="0"/>
-        </w:rPr>
-        <w:t>а) опыт;</w:t>
-      </w:r>
-    </w:p>
-    <w:p>
-      <w:r>
-        <w:rPr>
-          <w:b w:val="0"/>
-          <w:i w:val="0"/>
-        </w:rPr>
-        <w:t>б) образование;</w:t>
-      </w:r>
-    </w:p>
-    <w:p>
-      <w:r>
-        <w:rPr>
-          <w:b w:val="0"/>
-          <w:i w:val="0"/>
-        </w:rPr>
-        <w:t>в) условия работы.</w:t>
-      </w:r>
-    </w:p>
-    <w:p>
-      <w:r>
-        <w:rPr>
-          <w:b w:val="0"/>
-          <w:i w:val="0"/>
-        </w:rPr>
-        <w:t>Обязательные: 1-5</w:t>
-      </w:r>
-    </w:p>
-    <w:p>
-      <w:r>
-        <w:rPr>
-          <w:b/>
-        </w:rPr>
-        <w:t>Задание 25 — до 6 баллов</w:t>
-      </w:r>
-    </w:p>
-    <w:p>
-      <w:r>
-        <w:rPr>
-          <w:b w:val="0"/>
-          <w:i w:val="0"/>
-        </w:rPr>
-        <w:t>1) Фирма представляет собой коммерческую организацию, которая приобретает факторы производства с целью создания и продажи благ и получения на этой основе прибыли. Фирмы являются основной и самой массовой единицей предпринимательства, которая реализует такие функции в экономике как производство экономических благ, пополнение государственного бюджета за счет налогов, а также обеспечивают научно-технических прогресс за счет внедрения новых технологий в производство. Все это играет огромную роль в экономическом развитии государства, так как данные функции обеспечивают расширение национальной экономики, делают ее конкурентоспособной на мировом рынке.</w:t>
-      </w:r>
-    </w:p>
-    <w:p>
-      <w:r>
-        <w:rPr>
-          <w:b w:val="0"/>
-          <w:i w:val="0"/>
-        </w:rPr>
-        <w:t>2) Конкурентные преимущества фирмы: высокое качество продукции, использование инновационных оригинальных технологий, внедрение программ лояльности для постоянных клиентов</w:t>
-      </w:r>
-    </w:p>
-    <w:p>
-      <w:r>
-        <w:rPr>
-          <w:b w:val="0"/>
-          <w:i w:val="0"/>
-        </w:rPr>
-        <w:t>3) Примеры:</w:t>
-      </w:r>
-    </w:p>
-    <w:p>
-      <w:r>
-        <w:rPr>
-          <w:b w:val="0"/>
-          <w:i w:val="0"/>
-        </w:rPr>
-        <w:t>а) Качество продукции: компания «Барилла» производит макароны из качественной муки высшего сорта, что привлекает потребителей, в отличие от компании «Амелия», использующей менее качественное сырье. Это демонстрирует конкурентное преимущество в высоком качестве продукции.</w:t>
-      </w:r>
-    </w:p>
-    <w:p>
-      <w:r>
-        <w:rPr>
-          <w:b w:val="0"/>
-          <w:i w:val="0"/>
-        </w:rPr>
-        <w:t>б) Использование инновационных технологий: компания Apple занимает лидирующую позицию на рынке мобильных телефонов благодаря усовершенствованиям, таким как FaceID и мощные процессоры. В отличие от нее, Nokia не смогла предложить аналогичные новшества, что снизило спрос на ее продукцию.</w:t>
-      </w:r>
-    </w:p>
-    <w:p>
-      <w:r>
-        <w:rPr>
-          <w:b w:val="0"/>
-          <w:i w:val="0"/>
-        </w:rPr>
-        <w:t>в) Внедрение программ лояльности: торговая компания HM предлагает покупателям накапливать баллы для приобретения продукции, что увеличивает спрос по сравнению с конкурентами, такими как Inditex. Это иллюстрирует конкурентное преимущество через программы лояльности.</w:t>
-      </w:r>
-    </w:p>
     <w:sectPr>
-      <w:pgSz w:w="12240" w:h="15840"/>
-      <w:pgMar w:top="964" w:right="850" w:bottom="964" w:left="1134" w:header="720" w:footer="720" w:gutter="0"/>
+      <w:footerReference w:type="default" r:id="rId10"/>
+      <w:pgSz w:w="11906" w:h="16838"/>
+      <w:pgMar w:top="935" w:right="879" w:bottom="879" w:left="992" w:header="397" w:footer="397" w:gutter="0"/>
       <w:cols w:space="720"/>
       <w:docGrid w:linePitch="360"/>
     </w:sectPr>
   </w:body>
 </w:document>
+</file>
+
+<file path=word/footer1.xml><?xml version="1.0" encoding="utf-8"?>
+<w:ftr xmlns:m="http://schemas.openxmlformats.org/officeDocument/2006/math" xmlns:mc="http://schemas.openxmlformats.org/markup-compatibility/2006" xmlns:mo="http://schemas.microsoft.com/office/mac/office/2008/main" xmlns:mv="urn:schemas-microsoft-com:mac:vml" xmlns:o="urn:schemas-microsoft-com:office:office" xmlns:r="http://schemas.openxmlformats.org/officeDocument/2006/relationships" xmlns:v="urn:schemas-microsoft-com:vml" xmlns:w10="urn:schemas-microsoft-com:office:word" xmlns:w14="http://schemas.microsoft.com/office/word/2010/wordml" xmlns:w="http://schemas.openxmlformats.org/wordprocessingml/2006/main" xmlns:wne="http://schemas.microsoft.com/office/word/2006/wordml" xmlns:wp14="http://schemas.microsoft.com/office/word/2010/wordprocessingDrawing" xmlns:wp="http://schemas.openxmlformats.org/drawingml/2006/wordprocessingDrawing" xmlns:wpc="http://schemas.microsoft.com/office/word/2010/wordprocessingCanvas" xmlns:wpg="http://schemas.microsoft.com/office/word/2010/wordprocessingGroup" xmlns:wpi="http://schemas.microsoft.com/office/word/2010/wordprocessingInk" xmlns:wps="http://schemas.microsoft.com/office/word/2010/wordprocessingShape" mc:Ignorable="w14 wp14">
+  <w:p>
+    <w:pPr>
+      <w:pStyle w:val="Footer"/>
+    </w:pPr>
+  </w:p>
+</w:ftr>
 </file>
 
 <file path=word/numbering.xml><?xml version="1.0" encoding="utf-8"?>
@@ -3599,11 +3810,12 @@
     <w:qFormat/>
     <w:rsid w:val="00FC693F"/>
     <w:pPr>
-      <w:spacing w:after="100"/>
+      <w:spacing w:after="0" w:line="240" w:lineRule="auto"/>
     </w:pPr>
     <w:rPr>
-      <w:rFonts w:ascii="Arial" w:hAnsi="Arial"/>
-      <w:sz w:val="22"/>
+      <w:rFonts w:ascii="Times New Roman" w:hAnsi="Times New Roman"/>
+      <w:color w:val="181A1F"/>
+      <w:sz w:val="28"/>
     </w:rPr>
   </w:style>
   <w:style w:type="paragraph" w:styleId="Header">
@@ -3665,10 +3877,10 @@
       <w:outlineLvl w:val="0"/>
     </w:pPr>
     <w:rPr>
-      <w:rFonts w:asciiTheme="majorHAnsi" w:eastAsiaTheme="majorEastAsia" w:hAnsiTheme="majorHAnsi" w:cstheme="majorBidi" w:ascii="Arial" w:hAnsi="Arial"/>
+      <w:rFonts w:asciiTheme="majorHAnsi" w:eastAsiaTheme="majorEastAsia" w:hAnsiTheme="majorHAnsi" w:cstheme="majorBidi" w:ascii="Times New Roman" w:hAnsi="Times New Roman"/>
       <w:b/>
       <w:bCs/>
-      <w:color w:val="365F91" w:themeColor="accent1" w:themeShade="BF"/>
+      <w:color w:val="181A1F"/>
       <w:sz w:val="28"/>
       <w:szCs w:val="28"/>
     </w:rPr>

</xml_diff>